<commit_message>
Add submission builder, cover letter, graphical abstract; ORCID on title page; ignore submission/ package folder
</commit_message>
<xml_diff>
--- a/manuscript/drafts/manuscript_NoA.docx
+++ b/manuscript/drafts/manuscript_NoA.docx
@@ -75,6 +75,12 @@
       </w:pPr>
       <w:r>
         <w:t xml:space="preserve">Corresponding author: Ahmet Karakuş, akarakus@bartin.edu.tr</w:t>
+      </w:r>
+      <w:r>
+        <w:br/>
+      </w:r>
+      <w:r>
+        <w:t xml:space="preserve">ORCID: https://orcid.org/0000-0003-1458-808X</w:t>
       </w:r>
     </w:p>
     <w:bookmarkStart w:id="20" w:name="abstract"/>

</xml_diff>

<commit_message>
Methods 2.1: plan states the earlier 198->0 result explicitly and frames Stage 4 as its replication
</commit_message>
<xml_diff>
--- a/manuscript/drafts/manuscript_NoA.docx
+++ b/manuscript/drafts/manuscript_NoA.docx
@@ -165,7 +165,7 @@
         <w:pStyle w:val="BodyText"/>
       </w:pPr>
       <w:r>
-        <w:t xml:space="preserve">I tested both questions under an analysis plan written before any data were analysed. The primary hypothesis (H1) predicted that shared differentially expressed genes (DEGs) between AD and GBM would largely disappear once cell composition was controlled with two independent deconvolution methods. The secondary hypothesis (H2) predicted that any remaining signal would reflect overlap between the AD vulnerable-neuron signature and the GBM neural-mimicry signature, assessed with three complementary tests. Because the outcome of H1 had already been seen in the earlier analysis, H1 is here a pre-specified re-test, and its replication in an independent cohort carries more weight than the primary test. Flexible, data-dependent analysis decisions inflate false-positive rates (Simmons et al., 2011), so the hypotheses, thresholds, decision rules and publication framings for both possible outcomes were fixed in advance (Nosek et al., 2018), and every deviation from the plan was logged with its date. Age runs through both questions. AD and GBM are diseases of older age, cohorts of post-mortem brain often differ in age between groups, and age-related differences in cell composition and gene expression can mimic disease effects. Age was therefore a covariate in every model. Because comparisons between donors in single-cell data need donor-level inference (Squair et al., 2021), I also audited the implementation against the plan during the study and report how the problems it uncovered affected the results.</w:t>
+        <w:t xml:space="preserve">I tested both questions under an analysis plan written before any data were analysed. The primary hypothesis (H1) predicted that shared differentially expressed genes (DEGs) between AD and GBM would largely disappear once cell composition was controlled with two independent deconvolution methods. The secondary hypothesis (H2) predicted that any remaining signal would reflect overlap between the AD vulnerable-neuron signature and the GBM neural-mimicry signature, assessed with three complementary tests. Because the outcome of H1 had already been seen in the earlier analysis, the plan framed H1 from the start as a pre-specified re-test, and its replication in an independent cohort carries more weight than the primary test. Flexible, data-dependent analysis decisions inflate false-positive rates (Simmons et al., 2011), so the hypotheses, thresholds, decision rules and publication framings for both possible outcomes were fixed in advance (Nosek et al., 2018), and every deviation from the plan was logged with its date. Age runs through both questions. AD and GBM are diseases of older age, cohorts of post-mortem brain often differ in age between groups, and age-related differences in cell composition and gene expression can mimic disease effects. Age was therefore a covariate in every model. Because comparisons between donors in single-cell data need donor-level inference (Squair et al., 2021), I also audited the implementation against the plan during the study and report how the problems it uncovered affected the results.</w:t>
       </w:r>
     </w:p>
     <w:bookmarkEnd w:id="21"/>
@@ -200,7 +200,7 @@
         <w:pStyle w:val="BodyText"/>
       </w:pPr>
       <w:r>
-        <w:t xml:space="preserve">The plan was written after the earlier exploratory analysis (Karakuş, 2026a), which used overlapping data (GSE48350, GSE36980 and TCGA-GBM/GTEx) and had reported that shared DEGs disappear under BRETIGEA adjustment; the plan refers to the 198-gene shared signature of that analysis. Pre-specification therefore constrained the analytic choices of the present study, but it could not keep the likely outcome of H1 unknown to the author. The analyses that had not been run before, namely H2 at cell-type resolution, the donor and age analyses and the replication in GSE125583, did not have this limitation.</w:t>
+        <w:t xml:space="preserve">The plan was written after the earlier exploratory analysis (Karakuş, 2026a), which used overlapping data (GSE48350, GSE36980 and TCGA-GBM/GTEx) and had reported that shared DEGs disappear under BRETIGEA adjustment. The plan states that earlier result explicitly (198 shared DEGs falling to zero after adjustment for six BRETIGEA scores) and defines Stage 4 as an attempt to replicate it. Pre-specification therefore constrained the analytic choices of the present study, but it could not keep the likely outcome of H1 unknown to the author. The analyses that had not been run before, namely H2 at cell-type resolution, the donor and age analyses and the replication in GSE125583, did not have this limitation.</w:t>
       </w:r>
     </w:p>
     <w:p>

</xml_diff>

<commit_message>
Methods 2.2: neuropathological AD criteria for GSE36980 (Hokama 2014) and GSE125583 (Srinivasan 2020); Table 1 source for GSE125583
</commit_message>
<xml_diff>
--- a/manuscript/drafts/manuscript_NoA.docx
+++ b/manuscript/drafts/manuscript_NoA.docx
@@ -234,27 +234,7 @@
         <w:pStyle w:val="FirstParagraph"/>
       </w:pPr>
       <w:r>
-        <w:t xml:space="preserve">Table 1 lists the datasets and their roles. All are publicly available. In every AD cohort, group membership rests on post-mortem neuropathology rather than clinical symptoms: Braak neurofibrillary stage in the Leng data and GSE48350, the neuropathological diagnosis of the Hisayama study in GSE36980 </w:t>
-      </w:r>
-      <w:r>
-        <w:rPr>
-          <w:highlight w:val="yellow"/>
-        </w:rPr>
-        <w:t>[CHECK: exact criterion]</w:t>
-      </w:r>
-      <w:r>
-        <w:rPr/>
-        <w:t xml:space="preserve">, and Braak stage V–VI for the advanced AD group of GSE125583 </w:t>
-      </w:r>
-      <w:r>
-        <w:rPr>
-          <w:highlight w:val="yellow"/>
-        </w:rPr>
-        <w:t>[CHECK]</w:t>
-      </w:r>
-      <w:r>
-        <w:rPr/>
-        <w:t>. Sex refers to biological sex as recorded in each source; gender information was not available.</w:t>
+        <w:t xml:space="preserve">Table 1 lists the datasets and their roles. All are publicly available. In every AD cohort, group membership rests on post-mortem neuropathology rather than clinical symptoms: Braak neurofibrillary stage in the Leng data and GSE48350, the neuropathological diagnosis of the Hisayama study in GSE36980, where all AD cases had frequent CERAD neuritic plaques and Braak stage V–VI (Hokama et al., 2014), and, in GSE125583, a clinical diagnosis of AD confirmed neuropathologically by frequent CERAD neuritic plaques and Braak stage V–VI (Srinivasan et al., 2020). Sex refers to biological sex as recorded in each source; gender information was not available.</w:t>
       </w:r>
     </w:p>
     <w:p>
@@ -753,15 +733,7 @@
                 <w:rFonts w:ascii="Times New Roman" w:hAnsi="Times New Roman"/>
                 <w:sz w:val="20"/>
               </w:rPr>
-              <w:t xml:space="preserve">GSE125583 (SRP181886) </w:t>
-            </w:r>
-            <w:r>
-              <w:rPr>
-                <w:rFonts w:ascii="Times New Roman" w:hAnsi="Times New Roman"/>
-                <w:sz w:val="20"/>
-                <w:highlight w:val="yellow"/>
-              </w:rPr>
-              <w:t>[CHECK: source publication; candidate Srinivasan et al., 2020]</w:t>
+              <w:t xml:space="preserve">GSE125583 (SRP181886) (Srinivasan et al., 2020)</w:t>
             </w:r>
           </w:p>
         </w:tc>
@@ -6034,6 +6006,14 @@
       </w:pPr>
       <w:r>
         <w:t xml:space="preserve">Squair JW, Gautier M, Kathe C, Anderson MA, James ND, Hutson TH, et al. Confronting false discoveries in single-cell differential expression. Nat Commun 2021;12:5692. https://doi.org/10.1038/s41467-021-25960-2.</w:t>
+      </w:r>
+    </w:p>
+    <w:p>
+      <w:pPr>
+        <w:pStyle w:val="BodyText"/>
+      </w:pPr>
+      <w:r>
+        <w:t xml:space="preserve">Srinivasan K, Friedman BA, Etxeberria A, Huntley MA, van der Brug MP, Foreman O, et al. Alzheimer’s patient microglia exhibit enhanced aging and unique transcriptional activation. Cell Rep 2020;31:107843. https://doi.org/10.1016/j.celrep.2020.107843.</w:t>
       </w:r>
     </w:p>
     <w:p>

</xml_diff>

<commit_message>
GSE125583 re-run with SRX-matched covariates: H1 replicates (0.082); age imbalance reported; Section 3.6 updated; all documents updated
</commit_message>
<xml_diff>
--- a/manuscript/drafts/manuscript_NoA.docx
+++ b/manuscript/drafts/manuscript_NoA.docx
@@ -87,7 +87,7 @@
         <w:pStyle w:val="FirstParagraph"/>
       </w:pPr>
       <w:r>
-        <w:t xml:space="preserve">The inverse association between Alzheimer’s disease (AD) and cancer has prompted searches for transcriptomic signatures shared by AD and glioblastoma (GBM), but both diseases alter brain tissue composition, so genes that differ together in bulk samples may reflect cell composition. Two hypotheses were tested under a time-stamped analysis plan. For the primary hypothesis (H1), shared differentially expressed genes (DEGs) between a neuropathologically defined hippocampal AD meta-cohort (n = 51) and TCGA-GBM/GTEx (n = 338) were compared with and without covariates from two deconvolution methods (BRETIGEA, and MuSiC replacing the planned bMIND), and the BRETIGEA test was repeated in an independent AD cohort (n = 195). The 1,458 shared DEGs fell to zero after BRETIGEA adjustment, supporting H1 and repeating an earlier exploratory result; MuSiC gave the same count but implausible proportions. Noise covariates did not reproduce this loss, whereas components from random genes, which also captured composition, did. In the independent cohort, 30% of AD DEGs remained significant after adjustment, but only 3.5% of shared DEGs remained shared. For the secondary hypothesis (H2), three pre-specified tests did not detect overlap between vulnerable RORB+ entorhinal neurons and neural-like GBM states, with three donors per group. A convergence-like signal in the original analysis disappeared when age, but not donor, was modelled, because age and Braak stage did not overlap in the discovery cohort. Most of the bulk signature shared by AD and GBM is therefore associated with estimated cell composition, and cross-disease comparisons need composition adjustment, donor-level inference and attention to age.</w:t>
+        <w:t xml:space="preserve">The inverse association between Alzheimer’s disease (AD) and cancer has prompted searches for transcriptomic signatures shared by AD and glioblastoma (GBM), but both diseases alter brain tissue composition, so genes that differ together in bulk samples may reflect cell composition. Two hypotheses were tested under a time-stamped analysis plan. For the primary hypothesis (H1), shared differentially expressed genes (DEGs) between a neuropathologically defined hippocampal AD meta-cohort (n = 51) and TCGA-GBM/GTEx (n = 338) were compared with and without covariates from two deconvolution methods (BRETIGEA, and MuSiC replacing the planned bMIND), and the BRETIGEA test was repeated in an independent AD cohort (n = 195). The 1,458 shared DEGs fell to zero after BRETIGEA adjustment, supporting H1 and repeating an earlier exploratory result; MuSiC gave the same count but implausible proportions. Noise covariates did not reproduce this loss, whereas components from random genes, which also captured composition, did. In the independent cohort, 31% of AD DEGs remained significant after adjustment, but only 3.7% of shared DEGs remained shared. For the secondary hypothesis (H2), three pre-specified tests did not detect overlap between vulnerable RORB+ entorhinal neurons and neural-like GBM states, with three donors per group. A convergence-like signal in the original analysis disappeared when age, but not donor, was modelled, because age and Braak stage did not overlap in the discovery cohort. Most of the bulk signature shared by AD and GBM is therefore associated with estimated cell composition, and cross-disease comparisons need composition adjustment, donor-level inference and attention to age.</w:t>
       </w:r>
     </w:p>
     <w:p>
@@ -224,7 +224,7 @@
         <w:pStyle w:val="FirstParagraph"/>
       </w:pPr>
       <w:r>
-        <w:t xml:space="preserve">Table 1 lists the datasets and their roles. All are publicly available. In every AD cohort, group membership rests on post-mortem neuropathology rather than clinical symptoms: Braak neurofibrillary stage in the Leng data and GSE48350, the neuropathological diagnosis of the Hisayama study in GSE36980, where all AD cases had frequent CERAD neuritic plaques and Braak stage V–VI (Hokama et al., 2014), and, in GSE125583, a clinical diagnosis of AD confirmed neuropathologically by frequent CERAD neuritic plaques and Braak stage V–VI (Srinivasan et al., 2020). Sex refers to biological sex as recorded in each source; gender information was not available.</w:t>
+        <w:t xml:space="preserve">Table 1 lists the datasets and their roles. All are publicly available. In every AD cohort, group membership rests on post-mortem neuropathology rather than clinical symptoms: Braak neurofibrillary stage in the Leng data and GSE48350, the neuropathological diagnosis of the Hisayama study in GSE36980, where all AD cases had frequent CERAD neuritic plaques and Braak stage V–VI (Hokama et al., 2014), and, in GSE125583, a diagnosis of AD with Braak stage V–VI (advanced AD), compared with controls without a diagnosis of AD whose Braak stages ranged from I to IV (I, 3; II, 10; III, 26; IV, 31) (Srinivasan et al., 2020). Sex refers to biological sex as recorded in each source; gender information was not available.</w:t>
       </w:r>
     </w:p>
     <w:p>
@@ -1356,17 +1356,7 @@
         <w:t xml:space="preserve">~ group + age + sex</w:t>
       </w:r>
       <w:r>
-        <w:t xml:space="preserve">, and neuron, astrocyte and microglia marker scores (the mean z-score of each marker set) were then added as covariates. The cohort as analysed is saved to disk by a script (R/12_build_gse125583_bulk.R), but the upstream download and log-CPM steps are not yet scripted </w:t>
-      </w:r>
-      <w:r>
-        <w:rPr>
-          <w:highlight w:val="yellow"/>
-        </w:rPr>
-        <w:t>[CHECK: loading script to be added before submission]</w:t>
-      </w:r>
-      <w:r>
-        <w:rPr/>
-        <w:t>.</w:t>
+        <w:t xml:space="preserve">, and the BRETIGEA neuron, astrocyte and microglia scores were then added as covariates (an earlier version used marker scores whose gene sets had not been recorded). The cohort is rebuilt from recount3 and GEO by a script that matches GEO phenotypes to expression profiles by SRA experiment accession and computes log-CPM from the coverage values with an edgeR prior count of 3 (R/12_0_download_gse125583.R). Rebuilding the cohort in this way revealed an error in its first version, in which age and sex had been attached to the expression profiles by position rather than by sample identifier; all GSE125583 results reported here come from the corrected cohort (Section 4.6).</w:t>
       </w:r>
     </w:p>
     <w:p>
@@ -1417,7 +1407,7 @@
         <w:t xml:space="preserve"> </w:t>
       </w:r>
       <w:r>
-        <w:t xml:space="preserve">and Model B adding the six BRETIGEA scores, fitted with limma-trend; the GBM models were left unchanged. This analysis used the gene-symbol-level matrix and the six BRETIGEA scores, whereas the stress-gene analysis above used the Ensembl-level matrix and three marker scores, so their genome-wide DEG counts differ slightly. The shared-DEG ratio B/A was labelled as replicating H1 if at most 0.20, not replicating if at least 0.50, and partial otherwise. MuSiC was not run, for the reasons given in Section 3.1. (ii) A 2 × 2 decomposition of the original DD signal: with the Braak II versus Braak 0 contrast held fixed, the RRHO2 DD and DU maxima and the top-200 DD overlap were computed with and without donor modelling (donor-summed edgeR) and with and without age. All four cells are reported, without a decision rule. (iii) A GBM sensitivity analysis: the Neftel pseudobulk profiles were scaled to one million per sample, transformed as log2(x + 1) and fitted with limma-trend (</w:t>
+        <w:t xml:space="preserve">and Model B adding the six BRETIGEA scores, fitted with limma-trend; the GBM models were left unchanged. The shared-DEG ratio B/A was labelled as replicating H1 if at most 0.20, not replicating if at least 0.50, and partial otherwise. MuSiC was not run, for the reasons given in Section 3.1. (ii) A 2 × 2 decomposition of the original DD signal: with the Braak II versus Braak 0 contrast held fixed, the RRHO2 DD and DU maxima and the top-200 DD overlap were computed with and without donor modelling (donor-summed edgeR) and with and without age. All four cells are reported, without a decision rule. (iii) A GBM sensitivity analysis: the Neftel pseudobulk profiles were scaled to one million per sample, transformed as log2(x + 1) and fitted with limma-trend (</w:t>
       </w:r>
       <w:r>
         <w:rPr>
@@ -2793,6 +2783,76 @@
                 <w:sz w:val="20"/>
               </w:rPr>
               <w:t xml:space="preserve">Pre-declared before running</w:t>
+            </w:r>
+          </w:p>
+        </w:tc>
+      </w:tr>
+      <w:tr>
+        <w:tc>
+          <w:tcPr/>
+          <w:p>
+            <w:pPr>
+              <w:pStyle w:val="Compact"/>
+              <w:spacing w:line="240" w:lineRule="auto" w:after="0"/>
+              <w:jc w:val="left"/>
+            </w:pPr>
+            <w:r>
+              <w:rPr>
+                <w:rFonts w:ascii="Times New Roman" w:hAnsi="Times New Roman"/>
+                <w:sz w:val="20"/>
+              </w:rPr>
+              <w:t xml:space="preserve">GSE125583 age and sex attached to samples by identifier</w:t>
+            </w:r>
+          </w:p>
+        </w:tc>
+        <w:tc>
+          <w:tcPr/>
+          <w:p>
+            <w:pPr>
+              <w:pStyle w:val="Compact"/>
+              <w:spacing w:line="240" w:lineRule="auto" w:after="0"/>
+              <w:jc w:val="left"/>
+            </w:pPr>
+            <w:r>
+              <w:rPr>
+                <w:rFonts w:ascii="Times New Roman" w:hAnsi="Times New Roman"/>
+                <w:sz w:val="20"/>
+              </w:rPr>
+              <w:t xml:space="preserve">First version attached them by position (58 of 195 sexes and 100 of 195 ages misassigned); corrected</w:t>
+            </w:r>
+          </w:p>
+        </w:tc>
+        <w:tc>
+          <w:tcPr/>
+          <w:p>
+            <w:pPr>
+              <w:pStyle w:val="Compact"/>
+              <w:spacing w:line="240" w:lineRule="auto" w:after="0"/>
+              <w:jc w:val="left"/>
+            </w:pPr>
+            <w:r>
+              <w:rPr>
+                <w:rFonts w:ascii="Times New Roman" w:hAnsi="Times New Roman"/>
+                <w:sz w:val="20"/>
+              </w:rPr>
+              <w:t xml:space="preserve">Found when the cohort was rebuilt from public data</w:t>
+            </w:r>
+          </w:p>
+        </w:tc>
+        <w:tc>
+          <w:tcPr/>
+          <w:p>
+            <w:pPr>
+              <w:pStyle w:val="Compact"/>
+              <w:spacing w:line="240" w:lineRule="auto" w:after="0"/>
+              <w:jc w:val="left"/>
+            </w:pPr>
+            <w:r>
+              <w:rPr>
+                <w:rFonts w:ascii="Times New Roman" w:hAnsi="Times New Roman"/>
+                <w:sz w:val="20"/>
+              </w:rPr>
+              <w:t xml:space="preserve">Correction declared before re-running</w:t>
             </w:r>
           </w:p>
         </w:tc>
@@ -4084,15 +4144,15 @@
         <w:pStyle w:val="FirstParagraph"/>
       </w:pPr>
       <w:r>
-        <w:t xml:space="preserve">In GSE125583 (125 advanced AD, 70 controls), Model A gave 9,306 AD DEGs, of which 3,912 were shared with GBM. With the BRETIGEA scores added, the model gave 4,242 AD DEGs (diagnosis VIF 1.4) and 288 shared DEGs. The pre-declared shared-DEG ratio (288/3,912 = 0.074) was below the threshold of 0.20, so H1 replicated. With the fold-change thresholds, shared DEGs fell from 1,105 to 3 (ratio 0.003). Figure S1 compares the two AD cohorts. Supplementary Table S1b lists the 3,912 shared genes and marks those that remained shared, and Table S1c lists the genes that became shared only after adjustment.</w:t>
-      </w:r>
-    </w:p>
-    <w:p>
-      <w:pPr>
-        <w:pStyle w:val="BodyText"/>
-      </w:pPr>
-      <w:r>
-        <w:t xml:space="preserve">The ratio compares counts, not genes, so the genes that remained were also identified (this was not pre-declared). Of the 9,306 AD DEGs under Model A, 2,800 (30.1%) were still significant under Model B, and of the 14,811 GBM DEGs, 6,718 (45.4%) were. Of the 3,912 shared DEGs, only 138 (3.5%) were still shared after adjustment; the other 150 genes shared under Model B became shared only after adjustment.</w:t>
+        <w:t xml:space="preserve">In GSE125583 (125 advanced AD, 70 controls), Model A gave 8,314 AD DEGs, of which 3,435 were shared with GBM. With the BRETIGEA scores added, the model gave 4,457 AD DEGs (diagnosis VIF 1.38) and 282 shared DEGs. The pre-declared shared-DEG ratio (282/3,435 = 0.082) was below the threshold of 0.20, so H1 replicated. With the fold-change thresholds, shared DEGs fell from 935 to 2 (ratio 0.002). Figure S1 compares the two AD cohorts. Supplementary Table S1b lists the 3,435 shared genes and marks those that remained shared, and Table S1c lists the genes that became shared only after adjustment.</w:t>
+      </w:r>
+    </w:p>
+    <w:p>
+      <w:pPr>
+        <w:pStyle w:val="BodyText"/>
+      </w:pPr>
+      <w:r>
+        <w:t xml:space="preserve">The ratio compares counts, not genes, so the genes that remained were also identified (this was not pre-declared). Of the 8,314 AD DEGs under Model A, 2,586 (31.1%) were still significant under Model B, and of the 14,811 GBM DEGs, 6,718 (45.4%) were. Of the 3,435 shared DEGs, only 128 (3.7%) were still shared after adjustment; the other 154 genes shared under Model B became shared only after adjustment.</w:t>
       </w:r>
     </w:p>
     <w:p>
@@ -5250,15 +5310,15 @@
         <w:pStyle w:val="FirstParagraph"/>
       </w:pPr>
       <w:r>
-        <w:t xml:space="preserve">Six stress genes taken from the original DD quadrant (CEBPD, FLNA, JUNB, PER1, PFKFB3 and ZFP36L1) were examined in an AD cohort that is not part of the plan (GSE125583, fusiform cortex; 125 advanced AD, 70 controls). Age is balanced between the groups in this cohort (correlation between group and age r = 0.071; Wilcoxon P = 0.373).</w:t>
-      </w:r>
-    </w:p>
-    <w:p>
-      <w:pPr>
-        <w:pStyle w:val="BodyText"/>
-      </w:pPr>
-      <w:r>
-        <w:t xml:space="preserve">In the model adjusted for age and sex, all 20 genes of the DD signature kept the direction they had in the unadjusted model (log2FC correlation 1.000). All six stress genes were higher in advanced AD, and five reached FDR &lt; 0.05 (JUNB: FDR = 0.083; Supplementary Table S4). With neuron, astrocyte and microglia marker scores added, all six stayed up and five remained significant (log2FC between 0.27 and 0.44; JUNB: FDR = 0.087). Composition adjustment reduced the number of significant genes across the genome from 9,313 to 4,514 (these counts refer to the Ensembl-level matrix and three marker scores, and differ slightly from those in Section 3.4). Most of the genes in the neuronal category lost significance after this adjustment; only NRN1 remained down (log2FC from −1.30 to −0.45), and the direction of the BAIAP2 difference reversed. This fits with the bulk decline of these genes being largely a consequence of neuron loss (correlation between neuron score and group r = −0.42). None of the eight genes in the divergent, tumour-specific category remained significant. The astrocyte score did not differ between groups (r = −0.05).</w:t>
+        <w:t xml:space="preserve">Six stress genes taken from the original DD quadrant (CEBPD, FLNA, JUNB, PER1, PFKFB3 and ZFP36L1) were examined in an AD cohort that is not part of the plan (GSE125583, fusiform cortex; 125 advanced AD, 70 controls). The advanced AD group was younger than the controls (median 84 versus 87 years; correlation between group and age r = −0.27; Wilcoxon P = 4.7 × 10⁻⁴), so age was included in every model.</w:t>
+      </w:r>
+    </w:p>
+    <w:p>
+      <w:pPr>
+        <w:pStyle w:val="BodyText"/>
+      </w:pPr>
+      <w:r>
+        <w:t xml:space="preserve">In the model adjusted for age and sex, 19 of the 20 genes of the DD signature kept the direction they had in the unadjusted model (log2FC correlation 0.999; SDC3, with an estimate close to zero, changed sign). All six stress genes were higher in advanced AD, and five reached FDR &lt; 0.05 (JUNB: FDR = 0.11; Supplementary Table S4). With the BRETIGEA neuron, astrocyte and microglia scores added, all six stayed up and four remained significant (log2FC between 0.19 and 0.33; CEBPD: FDR = 0.052; JUNB: FDR = 0.34). Composition adjustment reduced the number of significant genes across the genome from 8,314 to 3,627. Most of the genes in the neuronal category lost significance after this adjustment; only NRN1 remained down (log2FC from −1.25 to −0.42), and the direction of the BAIAP2 difference reversed. This fits with the bulk decline of these genes being largely a consequence of neuron loss (correlation between neuron score and group r = −0.43). None of the eight genes in the divergent, tumour-specific category remained significant. The astrocyte score was slightly lower (r = −0.18) and the microglia score slightly higher (r = 0.16) in advanced AD.</w:t>
       </w:r>
     </w:p>
     <w:p>
@@ -5478,7 +5538,7 @@
         <w:pStyle w:val="FirstParagraph"/>
       </w:pPr>
       <w:r>
-        <w:t xml:space="preserve">Six stress genes taken from the original DD quadrant were higher in advanced AD in an independent cohort, even after adjustment for age, sex and marker-based composition. There are three reasons to be cautious about this. First, the DD signal that led to these genes being chosen does not survive analytic correction. Second, their rise in bulk tissue is the opposite of the decrease seen in vulnerable neurons in the discovery cohort, so it cannot be read as a directional convergence. Third, gene expression profiles of post-mortem brain can be strongly affected by agonal conditions before death (Tomita et al., 2004). Immediate-early genes, the family to which JUNB belongs, can also be induced ex vivo during tissue dissociation in single-cell studies (van den Brink et al., 2017), and a similar artefactual signal, most prominent in microglia, has been found in post-mortem human single-nucleus data (Marsh et al., 2022). With bulk data it is not possible to tell whether the increase reflects the molecular remodelling of reactive astrocytes (Escartin et al., 2021) or technical and agonal factors of this kind. These genes include PFKFB3, a hypoxia-responsive glycolytic regulator, so the observation touches on hypoxia-based accounts of the AD-cancer relationship (Su et al., 2023). The present data neither support nor refute such accounts at the level of mechanism; they show only that a shared stress or hypoxia programme is not detectable in the cell types studied here once the analytic problems described above are addressed. The observation is best treated as descriptive, with its cellular source still to be established with single-cell data, and not as evidence for a shared AD-GBM axis.</w:t>
+        <w:t xml:space="preserve">Six stress genes taken from the original DD quadrant were higher in advanced AD in an independent cohort, even after adjustment for age, sex and estimated composition, although only four of the six remained significant. There are three reasons to be cautious about this. First, the DD signal that led to these genes being chosen does not survive analytic correction. Second, their rise in bulk tissue is the opposite of the decrease seen in vulnerable neurons in the discovery cohort, so it cannot be read as a directional convergence. Third, gene expression profiles of post-mortem brain can be strongly affected by agonal conditions before death (Tomita et al., 2004). Immediate-early genes, the family to which JUNB belongs, can also be induced ex vivo during tissue dissociation in single-cell studies (van den Brink et al., 2017), and a similar artefactual signal, most prominent in microglia, has been found in post-mortem human single-nucleus data (Marsh et al., 2022). With bulk data it is not possible to tell whether the increase reflects the molecular remodelling of reactive astrocytes (Escartin et al., 2021) or technical and agonal factors of this kind. These genes include PFKFB3, a hypoxia-responsive glycolytic regulator, so the observation touches on hypoxia-based accounts of the AD-cancer relationship (Su et al., 2023). The present data neither support nor refute such accounts at the level of mechanism; they show only that a shared stress or hypoxia programme is not detectable in the cell types studied here once the analytic problems described above are addressed. The observation is best treated as descriptive, with its cellular source still to be established with single-cell data, and not as evidence for a shared AD-GBM axis.</w:t>
       </w:r>
     </w:p>
     <w:bookmarkEnd w:id="42"/>
@@ -5520,7 +5580,7 @@
         <w:pStyle w:val="BodyText"/>
       </w:pPr>
       <w:r>
-        <w:t xml:space="preserve">The AD meta-cohort is small (n = 51) and relies on merging two microarray platforms with ComBat. The complete loss of AD DEGs in this cohort did not recur in the larger GSE125583 cohort, where about 30% remained significant after adjustment, so the size of the effect in the meta-cohort should not be generalised; preserving diagnosis as a covariate can inflate significance in later tests when groups are unevenly spread across datasets (Nygaard et al., 2016). The plan’s exclusion criteria for RNA quality and manner of death could not be applied to the GTEx samples. The Neftel data are publicly available only as TPM values, which are not ideal for negative binomial models; a limma-trend analysis on log-scaled TPM gave the same H2 decision. Finally, although the analysis plan was committed to a local git repository before any data were analysed, the public upload that the plan promised did not happen before the analysis. The timestamps were generated by the author and cannot be verified independently, so the study rests on a time-stamped, pre-specified plan and not on a formal preregistration. Every point where the implementation departed from the plan is recorded in the deviation register, together with the date on which it was found.</w:t>
+        <w:t xml:space="preserve">The AD meta-cohort is small (n = 51) and relies on merging two microarray platforms with ComBat. The complete loss of AD DEGs in this cohort did not recur in the larger GSE125583 cohort, where about 31% remained significant after adjustment, so the size of the effect in the meta-cohort should not be generalised; preserving diagnosis as a covariate can inflate significance in later tests when groups are unevenly spread across datasets (Nygaard et al., 2016). The plan’s exclusion criteria for RNA quality and manner of death could not be applied to the GTEx samples. In GSE125583, the controls were not free of pathology: most were at Braak stage III or IV, so the contrast with advanced AD is between late and intermediate tau stages and probably underestimates the disease effect; the AD group was also younger than the controls. The first version of this cohort attached age and sex to the expression profiles by position rather than by sample identifier. The error was found when the cohort was rebuilt from the public data; after correction the H1 decision did not change (shared-DEG ratio 0.074 before and 0.082 after), and all numbers reported here come from the corrected cohort. The Neftel data are publicly available only as TPM values, which are not ideal for negative binomial models; a limma-trend analysis on log-scaled TPM gave the same H2 decision. Finally, although the analysis plan was committed to a local git repository before any data were analysed, the public upload that the plan promised did not happen before the analysis. The timestamps were generated by the author and cannot be verified independently, so the study rests on a time-stamped, pre-specified plan and not on a formal preregistration. Every point where the implementation departed from the plan is recorded in the deviation register, together with the date on which it was found.</w:t>
       </w:r>
     </w:p>
     <w:bookmarkEnd w:id="43"/>
@@ -5538,7 +5598,7 @@
         <w:pStyle w:val="FirstParagraph"/>
       </w:pPr>
       <w:r>
-        <w:t xml:space="preserve">In two AD cohorts, most of the transcriptomic signature shared by AD and GBM in bulk tissue was lost after adjustment for estimated cell composition (all of it in the primary cohort, and all but 3.5% of the shared genes in the replication cohort), while about 30% of the AD DEGs remained significant in the larger cohort. At cell-type resolution, no overlap between vulnerable-neuron identity and the neural-mimicry states of the tumour could be detected with the donors available. A convergence-like signal in the discovery analysis disappeared once age was modelled, while pseudoreplication separately inflated the number of significant genes. Claims of shared biology from cross-disease transcriptomic comparisons are only as reliable as the composition control, donor-level inference and pre-specified analysis behind them.</w:t>
+        <w:t xml:space="preserve">In two AD cohorts, most of the transcriptomic signature shared by AD and GBM in bulk tissue was lost after adjustment for estimated cell composition (all of it in the primary cohort, and all but 3.7% of the shared genes in the replication cohort), while about 31% of the AD DEGs remained significant in the larger cohort. At cell-type resolution, no overlap between vulnerable-neuron identity and the neural-mimicry states of the tumour could be detected with the donors available. A convergence-like signal in the discovery analysis disappeared once age was modelled, while pseudoreplication separately inflated the number of significant genes. Claims of shared biology from cross-disease transcriptomic comparisons are only as reliable as the composition control, donor-level inference and pre-specified analysis behind them.</w:t>
       </w:r>
     </w:p>
     <w:bookmarkEnd w:id="44"/>
@@ -6245,7 +6305,7 @@
         <w:t xml:space="preserve"> </w:t>
       </w:r>
       <w:r>
-        <w:t xml:space="preserve">(single Excel file, one sheet per table). Table S1a: the 1,458 shared DEGs of the primary analysis, with log2FC and FDR in both cohorts under Models A, B and C. Table S1b: the 3,912 shared DEGs of the replication analysis (GSE125583), with estimates under Models A and B and an indicator for the 138 genes that remained shared after adjustment. Table S1c: the 150 genes that were shared only after adjustment. Table S2: correlations of the 50 BRETIGEA astrocyte markers with the astrocyte score in the GBM cohort, in all samples, tumours and controls. Table S3: RRHO2 quadrant maxima, positions, adjusted P values and quadrant boundaries for all Stage 3 analyses (S3a), the donor × age decomposition (S3b) and the GBM limma-trend sensitivity analysis (S3c). Table S4: the DD-signature and stress genes in GSE125583 under the unadjusted, age- and sex-adjusted and composition-adjusted models. Abbreviations: BRETIGEA, BRain cEll Type specIfic Gene Expression Analysis; DD, down in both diseases; DEG, differentially expressed gene; FDR, false discovery rate; GBM, glioblastoma; log2FC, log2 fold change; RRHO2, rank-rank hypergeometric overlap, version 2.</w:t>
+        <w:t xml:space="preserve">(single Excel file, one sheet per table). Table S1a: the 1,458 shared DEGs of the primary analysis, with log2FC and FDR in both cohorts under Models A, B and C. Table S1b: the 3,435 shared DEGs of the replication analysis (GSE125583), with estimates under Models A and B and an indicator for the 128 genes that remained shared after adjustment. Table S1c: the 154 genes that were shared only after adjustment. Table S2: correlations of the 50 BRETIGEA astrocyte markers with the astrocyte score in the GBM cohort, in all samples, tumours and controls. Table S3: RRHO2 quadrant maxima, positions, adjusted P values and quadrant boundaries for all Stage 3 analyses (S3a), the donor × age decomposition (S3b) and the GBM limma-trend sensitivity analysis (S3c). Table S4: the DD-signature and stress genes in GSE125583 under the unadjusted, age- and sex-adjusted and composition-adjusted models. Abbreviations: BRETIGEA, BRain cEll Type specIfic Gene Expression Analysis; DD, down in both diseases; DEG, differentially expressed gene; FDR, false discovery rate; GBM, glioblastoma; log2FC, log2 fold change; RRHO2, rank-rank hypergeometric overlap, version 2.</w:t>
       </w:r>
     </w:p>
     <w:p>

</xml_diff>

<commit_message>
Add Zenodo record URL alongside concept DOI; reference to v1.1
</commit_message>
<xml_diff>
--- a/manuscript/drafts/manuscript_NoA.docx
+++ b/manuscript/drafts/manuscript_NoA.docx
@@ -5689,7 +5689,7 @@
         <w:pStyle w:val="FirstParagraph"/>
       </w:pPr>
       <w:r>
-        <w:t xml:space="preserve">All datasets analysed are publicly available (Table 1). The analysis plan, analysis scripts, deviation register, intermediate results and the facts-sheet script are available at https://github.com/akarakus-bartin/ad-gbm-composition and archived on Zenodo at https://doi.org/10.5281/zenodo.23020912 (Karakuş, 2026b).</w:t>
+        <w:t xml:space="preserve">All datasets analysed are publicly available (Table 1). The analysis plan, analysis scripts, deviation register, intermediate results and the facts-sheet script are available at https://github.com/akarakus-bartin/ad-gbm-composition and archived on Zenodo at https://doi.org/10.5281/zenodo.23020912 (Karakuş, 2026b); the Zenodo record page, which always shows the latest version, is https://zenodo.org/records/23020912.</w:t>
       </w:r>
     </w:p>
     <w:bookmarkEnd w:id="50"/>
@@ -5877,7 +5877,7 @@
         <w:pStyle w:val="BodyText"/>
       </w:pPr>
       <w:r>
-        <w:t xml:space="preserve">Karakuş A. AD–GBM transcriptomic overlap under cell-composition adjustment: code, pre-specified analysis plan and deviation register. Version v1.0-submission [software]. Zenodo 2026b. https://doi.org/10.5281/zenodo.23020912.</w:t>
+        <w:t xml:space="preserve">Karakuş A. AD–GBM transcriptomic overlap under cell-composition adjustment: code, pre-specified analysis plan and deviation register. Version v1.1-submission [software]. Zenodo 2026b. https://doi.org/10.5281/zenodo.23020912.</w:t>
       </w:r>
     </w:p>
     <w:p>

</xml_diff>

<commit_message>
Pre-submission fixes after review: clean supplementary xlsx; annotated guide to deviation register (Supp. File 2); immune-cell filter in Methods 2.4; calibrated H2 wording in Figure 1 and graphical abstract; graphical abstract shows 282 (128 retained + 154 new)
</commit_message>
<xml_diff>
--- a/manuscript/drafts/manuscript_NoA.docx
+++ b/manuscript/drafts/manuscript_NoA.docx
@@ -198,7 +198,7 @@
         <w:pStyle w:val="BodyText"/>
       </w:pPr>
       <w:r>
-        <w:t xml:space="preserve">Every deviation from the plan is recorded, with its date, reason and the analyses it affected, in a deviation register (DEVIATIONS.md; Supplementary File 2). Partway through the project, an audit of the implementation against the plan showed that the primary analyses had departed from the plan at several points without documentation (Section 2.7 and Table 2). After the audit, all hypothesis tests were re-run in a plan-conformant way. For each re-run, the analysis choices were written into the script header and committed before results were produced, so every results commit follows the commit that fixed its decisions. There is one exception. The Stage 1 code was first executed in the R console; the script file was created a few minutes later, with identical code and before the results were inspected, and this is noted in the register.</w:t>
+        <w:t xml:space="preserve">Every deviation from the plan is recorded, with its date, reason and the analyses it affected, in a deviation register (DEVIATIONS.md, in the project repository); an annotated English guide to it, which identifies superseded and corrected entries, is given in Supplementary File 2. Partway through the project, an audit of the implementation against the plan showed that the primary analyses had departed from the plan at several points without documentation (Section 2.7 and Table 2). After the audit, all hypothesis tests were re-run in a plan-conformant way. For each re-run, the analysis choices were written into the script header and committed before results were produced, so every results commit follows the commit that fixed its decisions. There is one exception. The Stage 1 code was first executed in the R console; the script file was created a few minutes later, with identical code and before the results were inspected, and this is noted in the register.</w:t>
       </w:r>
     </w:p>
     <w:p>
@@ -954,7 +954,7 @@
         <w:t xml:space="preserve">”</w:t>
       </w:r>
       <w:r>
-        <w:t xml:space="preserve">, following the original meta-module assignments. Cycling cells and cells assigned to two intermediate states were excluded. Pseudobulk profiles were built for each tumour × group combination; after the minimum-cell filter, 36 samples from 20 tumours remained (17 neural lineage, 19 other). The plan expected 24 tumours (deviation; Table 2). Because tumour enters the model as a fixed effect, the group contrast draws its information from the 16 tumours that contribute samples to both groups. As planned, differential expression was tested with a paired design that blocks on tumour (</w:t>
+        <w:t xml:space="preserve">, following the original meta-module assignments. Cycling cells and cells assigned to two intermediate states were excluded. Because about 42% of the cells assigned to the MES-like state expressed high levels of myeloid markers, non-malignant immune cells were then removed with a simplified form of the marker-based component of the original malignant-cell definition (Neftel et al., 2019): cells with PTPRC (CD45) expression above 1, or a mean expression of six macrophage markers (CD14, AIF1, FCER1G, FCGR3A, TYROBP and CSF1R) above 4, on the expression scale of the processed GEO matrix, were excluded. This removed 707 of 5,742 cells (12.3%) and reduced the myeloid contamination of the MES-like group from about 42% to about 6% (deviation; Table 2). Pseudobulk profiles were built for each tumour × group combination; after the minimum-cell filter, 36 samples from 20 tumours remained (17 neural lineage, 19 other). The plan expected 24 tumours (deviation; Table 2). Because tumour enters the model as a fixed effect, the group contrast draws its information from the 16 tumours that contribute samples to both groups. As planned, differential expression was tested with a paired design that blocks on tumour (</w:t>
       </w:r>
       <w:r>
         <w:rPr>
@@ -1452,7 +1452,7 @@
         <w:t xml:space="preserve"> </w:t>
       </w:r>
       <w:r>
-        <w:t xml:space="preserve">Deviations from the plan (summary; full register in Supplementary File 2).</w:t>
+        <w:t xml:space="preserve">Deviations from the plan (summary; see Supplementary File 2 and the full register in the project repository).</w:t>
       </w:r>
     </w:p>
     <w:tbl>
@@ -1915,6 +1915,76 @@
                 <w:sz w:val="20"/>
               </w:rPr>
               <w:t xml:space="preserve">Found in the audit</w:t>
+            </w:r>
+          </w:p>
+        </w:tc>
+      </w:tr>
+      <w:tr>
+        <w:tc>
+          <w:tcPr/>
+          <w:p>
+            <w:pPr>
+              <w:pStyle w:val="Compact"/>
+              <w:spacing w:line="240" w:lineRule="auto" w:after="0"/>
+              <w:jc w:val="left"/>
+            </w:pPr>
+            <w:r>
+              <w:rPr>
+                <w:rFonts w:ascii="Times New Roman" w:hAnsi="Times New Roman"/>
+                <w:sz w:val="20"/>
+              </w:rPr>
+              <w:t xml:space="preserve">Stage 2: malignant cells as annotated</w:t>
+            </w:r>
+          </w:p>
+        </w:tc>
+        <w:tc>
+          <w:tcPr/>
+          <w:p>
+            <w:pPr>
+              <w:pStyle w:val="Compact"/>
+              <w:spacing w:line="240" w:lineRule="auto" w:after="0"/>
+              <w:jc w:val="left"/>
+            </w:pPr>
+            <w:r>
+              <w:rPr>
+                <w:rFonts w:ascii="Times New Roman" w:hAnsi="Times New Roman"/>
+                <w:sz w:val="20"/>
+              </w:rPr>
+              <w:t xml:space="preserve">Additional removal of immune cells (PTPRC &gt; 1 or mean macrophage-marker expression &gt; 4; 707 of 5,742 cells)</w:t>
+            </w:r>
+          </w:p>
+        </w:tc>
+        <w:tc>
+          <w:tcPr/>
+          <w:p>
+            <w:pPr>
+              <w:pStyle w:val="Compact"/>
+              <w:spacing w:line="240" w:lineRule="auto" w:after="0"/>
+              <w:jc w:val="left"/>
+            </w:pPr>
+            <w:r>
+              <w:rPr>
+                <w:rFonts w:ascii="Times New Roman" w:hAnsi="Times New Roman"/>
+                <w:sz w:val="20"/>
+              </w:rPr>
+              <w:t xml:space="preserve">Myeloid contamination of the MES-like state</w:t>
+            </w:r>
+          </w:p>
+        </w:tc>
+        <w:tc>
+          <w:tcPr/>
+          <w:p>
+            <w:pPr>
+              <w:pStyle w:val="Compact"/>
+              <w:spacing w:line="240" w:lineRule="auto" w:after="0"/>
+              <w:jc w:val="left"/>
+            </w:pPr>
+            <w:r>
+              <w:rPr>
+                <w:rFonts w:ascii="Times New Roman" w:hAnsi="Times New Roman"/>
+                <w:sz w:val="20"/>
+              </w:rPr>
+              <w:t xml:space="preserve">During analysis</w:t>
             </w:r>
           </w:p>
         </w:tc>
@@ -6287,7 +6357,7 @@
         <w:t xml:space="preserve"> </w:t>
       </w:r>
       <w:r>
-        <w:t xml:space="preserve">Deviation register (DEVIATIONS), with the date, reason and affected analyses of every departure from the plan.</w:t>
+        <w:t xml:space="preserve">Annotated guide to the deviation register: deviations from the plan in the final analyses, errors found during the study, and an entry-by-entry guide to the full dated log (DEVIATIONS.md, in the project repository), with superseded and corrected entries identified.</w:t>
       </w:r>
     </w:p>
     <w:p>

</xml_diff>

<commit_message>
Second review round: age covariate statements corrected; deviation table moved to Supp. File 2; Methods 2.1 shortened; neuropathology sentence narrowed; concrete checks in Methods 2.9
</commit_message>
<xml_diff>
--- a/manuscript/drafts/manuscript_NoA.docx
+++ b/manuscript/drafts/manuscript_NoA.docx
@@ -145,7 +145,7 @@
         <w:pStyle w:val="BodyText"/>
       </w:pPr>
       <w:r>
-        <w:t xml:space="preserve">Both questions were tested under an analysis plan written before any data were analysed. The primary hypothesis (H1) predicted that shared differentially expressed genes (DEGs) between AD and GBM would largely disappear once cell composition was controlled with two independent deconvolution methods. The secondary hypothesis (H2) predicted that any remaining signal would reflect overlap between the AD vulnerable-neuron signature and the GBM neural-mimicry signature, assessed with three complementary tests. Because the outcome of H1 had already been seen in the earlier analysis, the plan framed H1 from the start as a re-test, and its replication in an independent cohort carries more weight than the primary test. Flexible, data-dependent analysis decisions inflate false-positive rates (Simmons et al., 2011), the hypotheses, thresholds, decision rules and publication framings for both possible outcomes were written down before the analyses (Nosek et al., 2018), and every deviation from the plan was logged with its date. Age runs through both questions. AD and GBM are diseases of older age, cohorts of post-mortem brain often differ in age between groups, and age-related differences in cell composition and gene expression can mimic disease effects. Age was therefore a covariate in every model. Because comparisons between donors in single-cell data need donor-level inference (Squair et al., 2021), the implementation was also audited against the plan during the study, and the effect of the problems it uncovered on the results is reported.</w:t>
+        <w:t xml:space="preserve">Both questions were tested under an analysis plan written before any data were analysed. The primary hypothesis (H1) predicted that shared differentially expressed genes (DEGs) between AD and GBM would largely disappear once cell composition was controlled with two independent deconvolution methods. The secondary hypothesis (H2) predicted that any remaining signal would reflect overlap between the AD vulnerable-neuron signature and the GBM neural-mimicry signature, assessed with three complementary tests. Because the outcome of H1 had already been seen in the earlier analysis, the plan framed H1 from the start as a re-test, and its replication in an independent cohort carries more weight than the primary test. Flexible, data-dependent analysis decisions inflate false-positive rates (Simmons et al., 2011), the hypotheses, thresholds, decision rules and publication framings for both possible outcomes were written down before the analyses (Nosek et al., 2018), and every deviation from the plan was logged with its date. Age runs through both questions. AD and GBM are diseases of older age, cohorts of post-mortem brain often differ in age between groups, and age-related differences in cell composition and gene expression can mimic disease effects. Age was therefore a covariate in every AD model (Stage 1 and both bulk AD cohorts). It was not modelled in the GBM bulk cohort, and the Stage 2 comparison of cell states within tumours controls for it by design. Because comparisons between donors in single-cell data need donor-level inference (Squair et al., 2021), the implementation was also audited against the plan during the study, and the effect of the problems it uncovered on the results is reported.</w:t>
       </w:r>
     </w:p>
     <w:bookmarkEnd w:id="21"/>
@@ -158,13 +158,13 @@
         <w:t xml:space="preserve">2. Methods</w:t>
       </w:r>
     </w:p>
-    <w:bookmarkStart w:id="22" w:name="X4c6f99fedb6ca3ea25fd066fb673ea3d5726c2f"/>
+    <w:bookmarkStart w:id="22" w:name="analysis-plan-and-documented-changes"/>
     <w:p>
       <w:pPr>
         <w:pStyle w:val="Heading3"/>
       </w:pPr>
       <w:r>
-        <w:t xml:space="preserve">2.1 Pre-specified analysis plan and deviation register</w:t>
+        <w:t xml:space="preserve">2.1 Analysis plan and documented changes</w:t>
       </w:r>
     </w:p>
     <w:p>
@@ -172,23 +172,23 @@
         <w:pStyle w:val="FirstParagraph"/>
       </w:pPr>
       <w:r>
-        <w:t xml:space="preserve">The hypotheses, decision rules, thresholds and outcome-dependent publication scenarios were defined in an analysis plan before any data analysis (Supplementary File 1). The plan was committed to the project’s git repository as its first commit on 20 September 2026 (commit 3fcf8d1) and has not been modified since. The plan also committed to uploading it to a public repository before analysis; this was not done. The repository, with its full commit history, was made public at submission (https://github.com/akarakus-bartin/ad-gbm-composition); the submitted version is archived on Zenodo (Karakuş, 2026b). The commit timestamps were therefore generated on the author’s computer and have not been verified by an independent registry. The plan was committed nine days before the manuscript was first submitted, and the analyses, the audit described below and the re-analyses were all carried out in that period. The plan fixed the hypotheses, thresholds and decision rules before the data were analysed, but much of the implementation evolved while the work was under way. The study is therefore best described as following a documented analysis plan, not as a preregistered study.</w:t>
-      </w:r>
-    </w:p>
-    <w:p>
-      <w:pPr>
-        <w:pStyle w:val="BodyText"/>
-      </w:pPr>
-      <w:r>
-        <w:t xml:space="preserve">The plan was written after the earlier exploratory analysis (Karakuş, 2026a), which used overlapping data (GSE48350, GSE36980 and TCGA-GBM/GTEx) and had reported that shared DEGs disappear under BRETIGEA adjustment. The plan states that earlier result explicitly (198 shared DEGs falling to zero after adjustment for six BRETIGEA scores) and defines Stage 4 as an attempt to replicate it. Writing the plan in advance therefore constrained the analytic choices of the present study, but it could not keep the likely outcome of H1 unknown to the author. The analyses that had not been run before, namely H2 at cell-type resolution, the donor and age analyses and the replication in GSE125583, did not have this limitation.</w:t>
-      </w:r>
-    </w:p>
-    <w:p>
-      <w:pPr>
-        <w:pStyle w:val="BodyText"/>
-      </w:pPr>
-      <w:r>
-        <w:t xml:space="preserve">Every deviation from the plan is recorded, with its date, reason and the analyses it affected, in a deviation register (DEVIATIONS.md, in the project repository); an annotated English guide to it, which identifies superseded and corrected entries, is given in Supplementary File 2. Partway through the project, an audit of the implementation against the plan showed that the primary analyses, run from scripts drafted with the help of an AI assistant (Section 2.9), had departed from the plan at several points without documentation (Section 2.7 and Table 2). After the audit, all hypothesis tests were re-run in a plan-conformant way. For each re-run, the analysis choices were written into the script header and committed before results were produced, so every results commit follows the commit that fixed its decisions. There is one exception. The Stage 1 code was first executed in the R console; the script file was created a few minutes later, with identical code and before the results were inspected, and this is noted in the register.</w:t>
+        <w:t xml:space="preserve">The hypotheses, decision rules and thresholds were written in an analysis plan (Supplementary File 1) and committed to the project’s git repository on 20 September 2026 (commit 3fcf8d1), before any data were analysed; the plan has not been modified since. The repository, with its full history, was made public at submission (https://github.com/akarakus-bartin/ad-gbm-composition) and is archived on Zenodo (Karakuş, 2026b); its timestamps were generated locally and have not been verified by an independent registry. The plan was committed nine days before the manuscript was first submitted, and much of the implementation evolved during that period. The study therefore follows a documented analysis plan and is not a preregistered study.</w:t>
+      </w:r>
+    </w:p>
+    <w:p>
+      <w:pPr>
+        <w:pStyle w:val="BodyText"/>
+      </w:pPr>
+      <w:r>
+        <w:t xml:space="preserve">The plan was written after an earlier exploratory analysis (Karakuş, 2026a) of overlapping data (GSE48350, GSE36980 and TCGA-GBM/GTEx), which had found that 198 shared DEGs fell to zero after adjustment for BRETIGEA scores. The plan states this result and defines Stage 4 as an attempt to replicate it, so the plan constrained the analytic choices for H1 but could not keep its likely outcome unknown to the author. The cell-type-level test of H2, the donor and age analyses and the replication in GSE125583 had not been run before.</w:t>
+      </w:r>
+    </w:p>
+    <w:p>
+      <w:pPr>
+        <w:pStyle w:val="BodyText"/>
+      </w:pPr>
+      <w:r>
+        <w:t xml:space="preserve">The first implementation departed from the plan at several points that were not documented at the time (Section 2.9). An audit against the plan identified these departures, after which all hypothesis tests were re-run as the plan specifies, with the analysis choices committed before the results were produced. Departures that affect the final analyses are noted where they occur below and are listed with their reasons in Supplementary File 2, which also guides the reader through the full dated log of changes kept in the repository.</w:t>
       </w:r>
     </w:p>
     <w:p>
@@ -214,7 +214,7 @@
         <w:pStyle w:val="FirstParagraph"/>
       </w:pPr>
       <w:r>
-        <w:t xml:space="preserve">Table 1 lists the datasets and their roles. All are publicly available. In every AD cohort, group membership rests on post-mortem neuropathology rather than clinical symptoms: Braak neurofibrillary stage in the Leng data and GSE48350, the neuropathological diagnosis of the Hisayama study in GSE36980, where all AD cases had frequent CERAD neuritic plaques and Braak stage V–VI (Hokama et al., 2014), and, in GSE125583, a diagnosis of AD with Braak stage V–VI (advanced AD), compared with controls without a diagnosis of AD whose Braak stages ranged from I to IV (I, 3; II, 10; III, 26; IV, 31) (Srinivasan et al., 2020). Sex refers to biological sex as recorded in each source; gender information was not available.</w:t>
+        <w:t xml:space="preserve">Table 1 lists the datasets and their roles. All are publicly available. In every AD cohort, the AD group was defined by post-mortem neuropathology rather than clinical symptoms: Braak neurofibrillary stage in the Leng data and GSE48350, the neuropathological diagnosis of the Hisayama study in GSE36980, where all AD cases had frequent CERAD neuritic plaques and Braak stage V–VI (Hokama et al., 2014), and, in GSE125583, a diagnosis of AD with Braak stage V–VI (advanced AD) (Srinivasan et al., 2020). Controls were donors without a diagnosis of AD; their Braak stage was recorded in the Leng data (Braak 0) and in GSE125583 (I, 3; II, 10; III, 26; IV, 31) but not in GSE48350 or GSE36980 (Table 1). Sex refers to biological sex as recorded in each source; gender information was not available.</w:t>
       </w:r>
     </w:p>
     <w:p>
@@ -1053,7 +1053,7 @@
         <w:pStyle w:val="FirstParagraph"/>
       </w:pPr>
       <w:r>
-        <w:t xml:space="preserve">The processed entorhinal cortex excitatory-neuron object released by Leng et al. (2021) was used, with its scAlign (Johansen and Quon, 2019) subcluster labels. The plan defined vulnerable neurons by the 75th percentile of RORB expression. Instead, the three RORB+ subclusters that the original study identified as vulnerable (EC:Exc.s1, EC:Exc.s2 and EC:Exc.s4) were used, a documented deviation (Table 2). Raw counts were summed for each donor × subcluster combination, and combinations with fewer than 10 nuclei were dropped.</w:t>
+        <w:t xml:space="preserve">The processed entorhinal cortex excitatory-neuron object released by Leng et al. (2021) was used, with its scAlign (Johansen and Quon, 2019) subcluster labels. The plan defined vulnerable neurons by the 75th percentile of RORB expression. Instead, the three RORB+ subclusters that the original study identified as vulnerable (EC:Exc.s1, EC:Exc.s2 and EC:Exc.s4) were used, a documented deviation (Supplementary File 2). Raw counts were summed for each donor × subcluster combination, and combinations with fewer than 10 nuclei were dropped.</w:t>
       </w:r>
     </w:p>
     <w:p>
@@ -1194,7 +1194,7 @@
         <w:t xml:space="preserve">”</w:t>
       </w:r>
       <w:r>
-        <w:t xml:space="preserve">, following the original meta-module assignments. Cycling cells and cells assigned to two intermediate states were excluded. Because about 42% of the cells assigned to the MES-like state expressed high levels of myeloid markers, non-malignant immune cells were then removed with a simplified form of the marker-based component of the original malignant-cell definition (Neftel et al., 2019): cells with PTPRC (CD45) expression above 1, or a mean expression of six macrophage markers (CD14, AIF1, FCER1G, FCGR3A, TYROBP and CSF1R) above 4, on the expression scale of the processed GEO matrix, were excluded. This removed 707 of 5,742 cells (12.3%) and reduced the myeloid contamination of the MES-like group from about 42% to about 6% (deviation; Table 2). Pseudobulk profiles were built for each tumour × group combination; after the minimum-cell filter, 36 samples from 20 tumours remained (17 neural lineage, 19 other). The plan expected 24 tumours (deviation; Table 2). Because tumour enters the model as a fixed effect, the group contrast draws its information from the 16 tumours that contribute samples to both groups. As planned, differential expression was tested with a paired design that blocks on tumour (</w:t>
+        <w:t xml:space="preserve">, following the original meta-module assignments. Cycling cells and cells assigned to two intermediate states were excluded. Because about 42% of the cells assigned to the MES-like state expressed high levels of myeloid markers, non-malignant immune cells were then removed with a simplified form of the marker-based component of the original malignant-cell definition (Neftel et al., 2019): cells with PTPRC (CD45) expression above 1, or a mean expression of six macrophage markers (CD14, AIF1, FCER1G, FCGR3A, TYROBP and CSF1R) above 4, on the expression scale of the processed GEO matrix, were excluded. This removed 707 of 5,742 cells (12.3%) and reduced the myeloid contamination of the MES-like group from about 42% to about 6% (deviation; Supplementary File 2). Pseudobulk profiles were built for each tumour × group combination; after the minimum-cell filter, 36 samples from 20 tumours remained (17 neural lineage, 19 other). The plan expected 24 tumours (deviation; Supplementary File 2). Because tumour enters the model as a fixed effect, the group contrast draws its information from the 16 tumours that contribute samples to both groups. As planned, differential expression was tested with a paired design that blocks on tumour (</w:t>
       </w:r>
       <w:r>
         <w:rPr>
@@ -1239,7 +1239,7 @@
         <w:t xml:space="preserve"> </w:t>
       </w:r>
       <w:r>
-        <w:t xml:space="preserve">Both signatures were passed to RRHO2 (Cahill et al., 2018) (version 1.0) as complete gene lists ranked by sign(log2FC) × −log10(P), with a step size of 100 and the hypergeometric method (a 43 × 43 map). As required by the plan, significance was assessed at the highest −log10(P) in the quadrant for genes down in AD and up in GBM (DU). Quadrant boundaries are defined where RRHO2 splits each list into up- and down-regulated genes, that is, where the ranking statistic changes sign. The first version of the re-analysis script assumed the boundaries lay at the midpoint of the map. This was noticed while the figures were being prepared and was corrected; the DU values, and therefore the H2 decisions, did not change (see the deviation register). The plan specified a BH adjustment at this point; for consistency with the original implementation, the raw P value was multiplied by the number of pixels, which is more conservative (deviation; Table 2). The threshold was an adjusted P below 0.001. The maxima of the other three quadrants are reported for comparison.</w:t>
+        <w:t xml:space="preserve">Both signatures were passed to RRHO2 (Cahill et al., 2018) (version 1.0) as complete gene lists ranked by sign(log2FC) × −log10(P), with a step size of 100 and the hypergeometric method (a 43 × 43 map). As required by the plan, significance was assessed at the highest −log10(P) in the quadrant for genes down in AD and up in GBM (DU). Quadrant boundaries are defined where RRHO2 splits each list into up- and down-regulated genes, that is, where the ranking statistic changes sign. The first version of the re-analysis script assumed the boundaries lay at the midpoint of the map. This was noticed while the figures were being prepared and was corrected; the DU values, and therefore the H2 decisions, did not change (see the deviation register). The plan specified a BH adjustment at this point; for consistency with the original implementation, the raw P value was multiplied by the number of pixels, which is more conservative (deviation; Supplementary File 2). The threshold was an adjusted P below 0.001. The maxima of the other three quadrants are reported for comparison.</w:t>
       </w:r>
     </w:p>
     <w:p>
@@ -1329,7 +1329,7 @@
         <w:t xml:space="preserve"> </w:t>
       </w:r>
       <w:r>
-        <w:t xml:space="preserve">The GSE48350 and GSE36980 microarrays were normalised with RMA (Irizarry et al., 2003), and where several probes mapped to one gene symbol, the probe with the highest mean expression was kept. GSE48350 has no direct diagnosis field, so AD was defined by Braak stage (deviation); all ten AD samples were at Braak stage V or VI, and no Braak stage was recorded for the controls. The plan’s criterion of donors aged 65 years or older, specified for GSE48350, was also applied to GSE36980, which excluded one control aged 55 (GSM907865; deviation). GSE36980 thus contributed 17 of its 18 hippocampal samples, including one AD sample (GSM4764672) added to the series after its original publication. The only brain region shared by the two platforms is the hippocampus, so the analysis was restricted to hippocampal samples (deviation). Batch effects between datasets were removed with ComBat (Johnson et al., 2007; Leek et al., 2012) (sva 3.60.0). The plan named diagnosis and brain region as covariates to preserve. In practice, the candidate covariates were diagnosis, brain region and sex, and only those with at least two levels were included; after the hippocampal restriction brain region had a single level, so diagnosis and sex were preserved (deviation; Table 2). The plan’s acceptance criterion was met: the correlation between PC1 and dataset was r = −0.999 before correction and r = 0.093 after (threshold |r| &lt; 0.20), and the correlations of diagnosis with PC1 and PC2 were 0.485 and 0.405. Preserving diagnosis in ComBat can inflate significance in downstream tests when groups are unevenly distributed across batches (Nygaard et al., 2016), and this is discussed as a limitation.</w:t>
+        <w:t xml:space="preserve">The GSE48350 and GSE36980 microarrays were normalised with RMA (Irizarry et al., 2003), and where several probes mapped to one gene symbol, the probe with the highest mean expression was kept. GSE48350 has no direct diagnosis field, so AD was defined by Braak stage (deviation); all ten AD samples were at Braak stage V or VI, and no Braak stage was recorded for the controls. The plan’s criterion of donors aged 65 years or older, specified for GSE48350, was also applied to GSE36980, which excluded one control aged 55 (GSM907865; deviation). GSE36980 thus contributed 17 of its 18 hippocampal samples, including one AD sample (GSM4764672) added to the series after its original publication. The only brain region shared by the two platforms is the hippocampus, so the analysis was restricted to hippocampal samples (deviation). Batch effects between datasets were removed with ComBat (Johnson et al., 2007; Leek et al., 2012) (sva 3.60.0). The plan named diagnosis and brain region as covariates to preserve. In practice, the candidate covariates were diagnosis, brain region and sex, and only those with at least two levels were included; after the hippocampal restriction brain region had a single level, so diagnosis and sex were preserved (deviation; Supplementary File 2). The plan’s acceptance criterion was met: the correlation between PC1 and dataset was r = −0.999 before correction and r = 0.093 after (threshold |r| &lt; 0.20), and the correlations of diagnosis with PC1 and PC2 were 0.485 and 0.405. Preserving diagnosis in ComBat can inflate significance in downstream tests when groups are unevenly distributed across batches (Nygaard et al., 2016), and this is discussed as a limitation.</w:t>
       </w:r>
     </w:p>
     <w:p>
@@ -1692,7 +1692,51 @@
         <w:pStyle w:val="FirstParagraph"/>
       </w:pPr>
       <w:r>
-        <w:t xml:space="preserve">The study was carried out by a single author working with a large language model (Claude, Anthropic) as an assistant, in the same way from the first analyses to the last. The model proposed many of the analyses and corrections and drafted most of the analysis scripts and much of the manuscript text in response to the author’s instructions. The author ran every analysis script on his own computer, inspected the outputs, decided which analyses to run and which deviations to accept, and approved each decision before it was committed to the repository. All analyses of the data reported here were run by the author; the model produced only the schematic figures (Figure 1 and the graphical abstract) and the formatting of the manuscript files. The undocumented deviations described in Section 2.1 arose because the first versions of several scripts, drafted with the model, did not implement parts of the plan (donor-level inference and the age covariate in Stage 1, and the test of H1), and this was not noticed when the scripts were run. They were found in an audit in which the author, with the model’s assistance, compared each script with the plan. Two further language models (ChatGPT, OpenAI; Kimi, Moonshot AI) were used only to obtain critical reviews of draft manuscripts; the analyses added in response to those reviews were pre-declared and committed before they were run.</w:t>
+        <w:t xml:space="preserve">The study was carried out by a single author working with a large language model (Claude, Anthropic) as an assistant, in the same way from the first analyses to the last. The model proposed many of the analyses and corrections and drafted most of the analysis scripts and much of the manuscript text in response to the author’s instructions. The author ran every analysis script on his own computer, inspected the outputs, decided which analyses to run and which deviations to accept, and approved each decision before it was committed to the repository. All analyses of the data reported here were run by the author; the model produced only the schematic figures (Figure 1 and the graphical abstract) and the formatting of the manuscript files. The undocumented deviations described in Section 2.1 arose because the first versions of several scripts, drafted with the model, did not implement parts of the plan (donor-level inference and the age covariate in Stage 1, and the test of H1), and this was not noticed when the scripts were run. They were found in an audit in which the author, with the model’s assistance, compared each script with the plan. Checks on the code were added as the study progressed: comparison of each script with the plan, including model formulas and covariates; reproduction of the original Stage 3 result before its implementation was reused; comparison of sample counts with the plan and the source publications; rebuilding of the GSE125583 cohort from the public data with samples matched by accession, which reproduced the expression data exactly and revealed the covariate error described in Section 4.6; and generation of every reported number, table and figure by scripts from locked result files, several with built-in consistency checks. The errors described in Section 2.1 show that these checks were not all in place from the start. Two further language models (ChatGPT, OpenAI; Kimi, Moonshot AI) were used only to obtain critical reviews of draft manuscripts; the analyses added in response to those reviews were pre-declared and committed before they were run.</w:t>
+      </w:r>
+    </w:p>
+    <w:bookmarkEnd w:id="30"/>
+    <w:bookmarkEnd w:id="31"/>
+    <w:bookmarkStart w:id="38" w:name="results"/>
+    <w:p>
+      <w:pPr>
+        <w:pStyle w:val="Heading2"/>
+      </w:pPr>
+      <w:r>
+        <w:t xml:space="preserve">3. Results</w:t>
+      </w:r>
+    </w:p>
+    <w:p>
+      <w:pPr>
+        <w:pStyle w:val="FirstParagraph"/>
+      </w:pPr>
+      <w:r>
+        <w:t xml:space="preserve">The tests of the two pre-specified hypotheses are reported first (Sections 3.1–3.3), followed by the exploratory analyses, which do not enter the hypothesis decisions (Sections 3.4–3.6). All numbers come from the facts sheet generated from the locked result files.</w:t>
+      </w:r>
+    </w:p>
+    <w:bookmarkStart w:id="32" w:name="X68c9f0b60a362206b7b8bb2369086a73b9de177"/>
+    <w:p>
+      <w:pPr>
+        <w:pStyle w:val="Heading3"/>
+      </w:pPr>
+      <w:r>
+        <w:t xml:space="preserve">3.1 H1: shared DEGs are lost after adjustment for estimated cell composition</w:t>
+      </w:r>
+    </w:p>
+    <w:p>
+      <w:pPr>
+        <w:pStyle w:val="FirstParagraph"/>
+      </w:pPr>
+      <w:r>
+        <w:t xml:space="preserve">In the hippocampal AD meta-cohort (n = 51; 18 AD, 33 controls) and the TCGA-GBM/GTEx cohort (n = 338; 152 tumours, 186 controls), Model A without composition control gave 4,449 DEGs for AD and 14,811 for GBM at FDR &lt; 0.05 (Figure 2A). Of these, 1,458 genes differed in the same direction in both cohorts (Table 2; the full list, with estimates under every model, is in Supplementary Table S1a).</w:t>
+      </w:r>
+    </w:p>
+    <w:p>
+      <w:pPr>
+        <w:pStyle w:val="BodyText"/>
+      </w:pPr>
+      <w:r>
+        <w:t xml:space="preserve">Adding composition covariates reduced the number of shared DEGs to zero with both deconvolution methods (Model B, BRETIGEA: 0; Model C, MuSiC: 0; Figure 2C). Both ratios to Model A were 0.000, below the pre-specified threshold of 0.20, so H1 was supported under the plan’s decision rule. The result did not change in any of the pre-specified sensitivity analyses. With the fold-change threshold (413 shared DEGs under Model A), with controls restricted to BA9 (1,587) or to the hippocampus (1,240), and with the fold-change threshold applied to single-region controls (BA9: 485; hippocampus: 340), Models B and C gave zero shared DEGs in every case (Figure 2C). The exploratory Model D, with both sets of covariates, also gave none.</w:t>
       </w:r>
     </w:p>
     <w:p>
@@ -1705,1699 +1749,6 @@
           <w:b/>
         </w:rPr>
         <w:t xml:space="preserve">Table 2.</w:t>
-      </w:r>
-      <w:r>
-        <w:t xml:space="preserve"> </w:t>
-      </w:r>
-      <w:r>
-        <w:t xml:space="preserve">Deviations from the plan (summary; see Supplementary File 2 and the full register in the project repository).</w:t>
-      </w:r>
-    </w:p>
-    <w:tbl>
-      <w:tblPr>
-        <w:tblStyle w:val="Table"/>
-        <w:tblW w:type="pct" w:w="5000"/>
-        <w:tblLook w:firstRow="1" w:lastRow="0" w:firstColumn="0" w:lastColumn="0" w:noHBand="0" w:noVBand="0" w:val="0020"/>
-        <w:jc w:val="start"/>
-        <w:tblBorders>
-          <w:top w:val="single" w:sz="8" w:color="000000"/>
-          <w:left w:val="nil"/>
-          <w:bottom w:val="single" w:sz="8" w:color="000000"/>
-          <w:right w:val="nil"/>
-          <w:insideH w:val="nil"/>
-          <w:insideV w:val="nil"/>
-        </w:tblBorders>
-      </w:tblPr>
-      <w:tblGrid>
-        <w:gridCol w:w="1980"/>
-        <w:gridCol w:w="1980"/>
-        <w:gridCol w:w="1980"/>
-        <w:gridCol w:w="1980"/>
-      </w:tblGrid>
-      <w:tr>
-        <w:trPr>
-          <w:tblHeader w:val="true"/>
-        </w:trPr>
-        <w:tc>
-          <w:tcPr>
-            <w:tcBorders>
-              <w:bottom w:val="single" w:sz="4" w:color="000000"/>
-            </w:tcBorders>
-          </w:tcPr>
-          <w:p>
-            <w:pPr>
-              <w:pStyle w:val="Compact"/>
-              <w:spacing w:line="240" w:lineRule="auto" w:after="0"/>
-              <w:jc w:val="left"/>
-            </w:pPr>
-            <w:r>
-              <w:rPr>
-                <w:rFonts w:ascii="Times New Roman" w:hAnsi="Times New Roman"/>
-                <w:b/>
-                <w:sz w:val="20"/>
-              </w:rPr>
-              <w:t xml:space="preserve">Plan</w:t>
-            </w:r>
-          </w:p>
-        </w:tc>
-        <w:tc>
-          <w:tcPr>
-            <w:tcBorders>
-              <w:bottom w:val="single" w:sz="4" w:color="000000"/>
-            </w:tcBorders>
-          </w:tcPr>
-          <w:p>
-            <w:pPr>
-              <w:pStyle w:val="Compact"/>
-              <w:spacing w:line="240" w:lineRule="auto" w:after="0"/>
-              <w:jc w:val="left"/>
-            </w:pPr>
-            <w:r>
-              <w:rPr>
-                <w:rFonts w:ascii="Times New Roman" w:hAnsi="Times New Roman"/>
-                <w:b/>
-                <w:sz w:val="20"/>
-              </w:rPr>
-              <w:t xml:space="preserve">Implementation</w:t>
-            </w:r>
-          </w:p>
-        </w:tc>
-        <w:tc>
-          <w:tcPr>
-            <w:tcBorders>
-              <w:bottom w:val="single" w:sz="4" w:color="000000"/>
-            </w:tcBorders>
-          </w:tcPr>
-          <w:p>
-            <w:pPr>
-              <w:pStyle w:val="Compact"/>
-              <w:spacing w:line="240" w:lineRule="auto" w:after="0"/>
-              <w:jc w:val="left"/>
-            </w:pPr>
-            <w:r>
-              <w:rPr>
-                <w:rFonts w:ascii="Times New Roman" w:hAnsi="Times New Roman"/>
-                <w:b/>
-                <w:sz w:val="20"/>
-              </w:rPr>
-              <w:t xml:space="preserve">Reason</w:t>
-            </w:r>
-          </w:p>
-        </w:tc>
-        <w:tc>
-          <w:tcPr>
-            <w:tcBorders>
-              <w:bottom w:val="single" w:sz="4" w:color="000000"/>
-            </w:tcBorders>
-          </w:tcPr>
-          <w:p>
-            <w:pPr>
-              <w:pStyle w:val="Compact"/>
-              <w:spacing w:line="240" w:lineRule="auto" w:after="0"/>
-              <w:jc w:val="left"/>
-            </w:pPr>
-            <w:r>
-              <w:rPr>
-                <w:rFonts w:ascii="Times New Roman" w:hAnsi="Times New Roman"/>
-                <w:b/>
-                <w:sz w:val="20"/>
-              </w:rPr>
-              <w:t xml:space="preserve">When documented</w:t>
-            </w:r>
-          </w:p>
-        </w:tc>
-      </w:tr>
-      <w:tr>
-        <w:tc>
-          <w:tcPr/>
-          <w:p>
-            <w:pPr>
-              <w:pStyle w:val="Compact"/>
-              <w:spacing w:line="240" w:lineRule="auto" w:after="0"/>
-              <w:jc w:val="left"/>
-            </w:pPr>
-            <w:r>
-              <w:rPr>
-                <w:rFonts w:ascii="Times New Roman" w:hAnsi="Times New Roman"/>
-                <w:sz w:val="20"/>
-              </w:rPr>
-              <w:t xml:space="preserve">Stage 1: single subtype defined by the 75th RORB percentile</w:t>
-            </w:r>
-          </w:p>
-        </w:tc>
-        <w:tc>
-          <w:tcPr/>
-          <w:p>
-            <w:pPr>
-              <w:pStyle w:val="Compact"/>
-              <w:spacing w:line="240" w:lineRule="auto" w:after="0"/>
-              <w:jc w:val="left"/>
-            </w:pPr>
-            <w:r>
-              <w:rPr>
-                <w:rFonts w:ascii="Times New Roman" w:hAnsi="Times New Roman"/>
-                <w:sz w:val="20"/>
-              </w:rPr>
-              <w:t xml:space="preserve">Three RORB+ subclusters (s1, s2, s4) of Leng et al. (2021), summed per donor</w:t>
-            </w:r>
-          </w:p>
-        </w:tc>
-        <w:tc>
-          <w:tcPr/>
-          <w:p>
-            <w:pPr>
-              <w:pStyle w:val="Compact"/>
-              <w:spacing w:line="240" w:lineRule="auto" w:after="0"/>
-              <w:jc w:val="left"/>
-            </w:pPr>
-            <w:r>
-              <w:rPr>
-                <w:rFonts w:ascii="Times New Roman" w:hAnsi="Times New Roman"/>
-                <w:sz w:val="20"/>
-              </w:rPr>
-              <w:t xml:space="preserve">Vulnerable-subcluster definition of the original study</w:t>
-            </w:r>
-          </w:p>
-        </w:tc>
-        <w:tc>
-          <w:tcPr/>
-          <w:p>
-            <w:pPr>
-              <w:pStyle w:val="Compact"/>
-              <w:spacing w:line="240" w:lineRule="auto" w:after="0"/>
-              <w:jc w:val="left"/>
-            </w:pPr>
-            <w:r>
-              <w:rPr>
-                <w:rFonts w:ascii="Times New Roman" w:hAnsi="Times New Roman"/>
-                <w:sz w:val="20"/>
-              </w:rPr>
-              <w:t xml:space="preserve">During data inspection, before results</w:t>
-            </w:r>
-          </w:p>
-        </w:tc>
-      </w:tr>
-      <w:tr>
-        <w:tc>
-          <w:tcPr/>
-          <w:p>
-            <w:pPr>
-              <w:pStyle w:val="Compact"/>
-              <w:spacing w:line="240" w:lineRule="auto" w:after="0"/>
-              <w:jc w:val="left"/>
-            </w:pPr>
-            <w:r>
-              <w:rPr>
-                <w:rFonts w:ascii="Times New Roman" w:hAnsi="Times New Roman"/>
-                <w:sz w:val="20"/>
-              </w:rPr>
-              <w:t xml:space="preserve">Stage 1: Braak VI vs 0</w:t>
-            </w:r>
-          </w:p>
-        </w:tc>
-        <w:tc>
-          <w:tcPr/>
-          <w:p>
-            <w:pPr>
-              <w:pStyle w:val="Compact"/>
-              <w:spacing w:line="240" w:lineRule="auto" w:after="0"/>
-              <w:jc w:val="left"/>
-            </w:pPr>
-            <w:r>
-              <w:rPr>
-                <w:rFonts w:ascii="Times New Roman" w:hAnsi="Times New Roman"/>
-                <w:sz w:val="20"/>
-              </w:rPr>
-              <w:t xml:space="preserve">Kept as primary; Braak II vs 0 added as secondary contrast</w:t>
-            </w:r>
-          </w:p>
-        </w:tc>
-        <w:tc>
-          <w:tcPr/>
-          <w:p>
-            <w:pPr>
-              <w:pStyle w:val="Compact"/>
-              <w:spacing w:line="240" w:lineRule="auto" w:after="0"/>
-              <w:jc w:val="left"/>
-            </w:pPr>
-            <w:r>
-              <w:rPr>
-                <w:rFonts w:ascii="Times New Roman" w:hAnsi="Times New Roman"/>
-                <w:sz w:val="20"/>
-              </w:rPr>
-              <w:t xml:space="preserve">Neuron loss already apparent at Braak II</w:t>
-            </w:r>
-          </w:p>
-        </w:tc>
-        <w:tc>
-          <w:tcPr/>
-          <w:p>
-            <w:pPr>
-              <w:pStyle w:val="Compact"/>
-              <w:spacing w:line="240" w:lineRule="auto" w:after="0"/>
-              <w:jc w:val="left"/>
-            </w:pPr>
-            <w:r>
-              <w:rPr>
-                <w:rFonts w:ascii="Times New Roman" w:hAnsi="Times New Roman"/>
-                <w:sz w:val="20"/>
-              </w:rPr>
-              <w:t xml:space="preserve">Before results</w:t>
-            </w:r>
-          </w:p>
-        </w:tc>
-      </w:tr>
-      <w:tr>
-        <w:tc>
-          <w:tcPr/>
-          <w:p>
-            <w:pPr>
-              <w:pStyle w:val="Compact"/>
-              <w:spacing w:line="240" w:lineRule="auto" w:after="0"/>
-              <w:jc w:val="left"/>
-            </w:pPr>
-            <w:r>
-              <w:rPr>
-                <w:rFonts w:ascii="Times New Roman" w:hAnsi="Times New Roman"/>
-                <w:sz w:val="20"/>
-              </w:rPr>
-              <w:t xml:space="preserve">Stage 1: age and sex as covariates</w:t>
-            </w:r>
-          </w:p>
-        </w:tc>
-        <w:tc>
-          <w:tcPr/>
-          <w:p>
-            <w:pPr>
-              <w:pStyle w:val="Compact"/>
-              <w:spacing w:line="240" w:lineRule="auto" w:after="0"/>
-              <w:jc w:val="left"/>
-            </w:pPr>
-            <w:r>
-              <w:rPr>
-                <w:rFonts w:ascii="Times New Roman" w:hAnsi="Times New Roman"/>
-                <w:sz w:val="20"/>
-              </w:rPr>
-              <w:t xml:space="preserve">Age included; sex dropped</w:t>
-            </w:r>
-          </w:p>
-        </w:tc>
-        <w:tc>
-          <w:tcPr/>
-          <w:p>
-            <w:pPr>
-              <w:pStyle w:val="Compact"/>
-              <w:spacing w:line="240" w:lineRule="auto" w:after="0"/>
-              <w:jc w:val="left"/>
-            </w:pPr>
-            <w:r>
-              <w:rPr>
-                <w:rFonts w:ascii="Times New Roman" w:hAnsi="Times New Roman"/>
-                <w:sz w:val="20"/>
-              </w:rPr>
-              <w:t xml:space="preserve">All donors male</w:t>
-            </w:r>
-          </w:p>
-        </w:tc>
-        <w:tc>
-          <w:tcPr/>
-          <w:p>
-            <w:pPr>
-              <w:pStyle w:val="Compact"/>
-              <w:spacing w:line="240" w:lineRule="auto" w:after="0"/>
-              <w:jc w:val="left"/>
-            </w:pPr>
-            <w:r>
-              <w:rPr>
-                <w:rFonts w:ascii="Times New Roman" w:hAnsi="Times New Roman"/>
-                <w:sz w:val="20"/>
-              </w:rPr>
-              <w:t xml:space="preserve">Before results</w:t>
-            </w:r>
-          </w:p>
-        </w:tc>
-      </w:tr>
-      <w:tr>
-        <w:tc>
-          <w:tcPr/>
-          <w:p>
-            <w:pPr>
-              <w:pStyle w:val="Compact"/>
-              <w:spacing w:line="240" w:lineRule="auto" w:after="0"/>
-              <w:jc w:val="left"/>
-            </w:pPr>
-            <w:r>
-              <w:rPr>
-                <w:rFonts w:ascii="Times New Roman" w:hAnsi="Times New Roman"/>
-                <w:sz w:val="20"/>
-              </w:rPr>
-              <w:t xml:space="preserve">Stage 1: donor-level inference</w:t>
-            </w:r>
-          </w:p>
-        </w:tc>
-        <w:tc>
-          <w:tcPr/>
-          <w:p>
-            <w:pPr>
-              <w:pStyle w:val="Compact"/>
-              <w:spacing w:line="240" w:lineRule="auto" w:after="0"/>
-              <w:jc w:val="left"/>
-            </w:pPr>
-            <w:r>
-              <w:rPr>
-                <w:rFonts w:ascii="Times New Roman" w:hAnsi="Times New Roman"/>
-                <w:sz w:val="20"/>
-              </w:rPr>
-              <w:t xml:space="preserve">Original code did not model donor; re-analysis at donor level</w:t>
-            </w:r>
-          </w:p>
-        </w:tc>
-        <w:tc>
-          <w:tcPr/>
-          <w:p>
-            <w:pPr>
-              <w:pStyle w:val="Compact"/>
-              <w:spacing w:line="240" w:lineRule="auto" w:after="0"/>
-              <w:jc w:val="left"/>
-            </w:pPr>
-            <w:r>
-              <w:rPr>
-                <w:rFonts w:ascii="Times New Roman" w:hAnsi="Times New Roman"/>
-                <w:sz w:val="20"/>
-              </w:rPr>
-              <w:t xml:space="preserve">Pseudoreplication</w:t>
-            </w:r>
-          </w:p>
-        </w:tc>
-        <w:tc>
-          <w:tcPr/>
-          <w:p>
-            <w:pPr>
-              <w:pStyle w:val="Compact"/>
-              <w:spacing w:line="240" w:lineRule="auto" w:after="0"/>
-              <w:jc w:val="left"/>
-            </w:pPr>
-            <w:r>
-              <w:rPr>
-                <w:rFonts w:ascii="Times New Roman" w:hAnsi="Times New Roman"/>
-                <w:sz w:val="20"/>
-              </w:rPr>
-              <w:t xml:space="preserve">Found in the audit</w:t>
-            </w:r>
-          </w:p>
-        </w:tc>
-      </w:tr>
-      <w:tr>
-        <w:tc>
-          <w:tcPr/>
-          <w:p>
-            <w:pPr>
-              <w:pStyle w:val="Compact"/>
-              <w:spacing w:line="240" w:lineRule="auto" w:after="0"/>
-              <w:jc w:val="left"/>
-            </w:pPr>
-            <w:r>
-              <w:rPr>
-                <w:rFonts w:ascii="Times New Roman" w:hAnsi="Times New Roman"/>
-                <w:sz w:val="20"/>
-              </w:rPr>
-              <w:t xml:space="preserve">Stage 1: signature requires log2FC &lt; −0.5</w:t>
-            </w:r>
-          </w:p>
-        </w:tc>
-        <w:tc>
-          <w:tcPr/>
-          <w:p>
-            <w:pPr>
-              <w:pStyle w:val="Compact"/>
-              <w:spacing w:line="240" w:lineRule="auto" w:after="0"/>
-              <w:jc w:val="left"/>
-            </w:pPr>
-            <w:r>
-              <w:rPr>
-                <w:rFonts w:ascii="Times New Roman" w:hAnsi="Times New Roman"/>
-                <w:sz w:val="20"/>
-              </w:rPr>
-              <w:t xml:space="preserve">Not applied in the original code; applied in the re-analysis</w:t>
-            </w:r>
-          </w:p>
-        </w:tc>
-        <w:tc>
-          <w:tcPr/>
-          <w:p>
-            <w:pPr>
-              <w:pStyle w:val="Compact"/>
-              <w:spacing w:line="240" w:lineRule="auto" w:after="0"/>
-              <w:jc w:val="left"/>
-            </w:pPr>
-            <w:r>
-              <w:rPr>
-                <w:rFonts w:ascii="Times New Roman" w:hAnsi="Times New Roman"/>
-                <w:sz w:val="20"/>
-              </w:rPr>
-              <w:t xml:space="preserve">Return to the plan</w:t>
-            </w:r>
-          </w:p>
-        </w:tc>
-        <w:tc>
-          <w:tcPr/>
-          <w:p>
-            <w:pPr>
-              <w:pStyle w:val="Compact"/>
-              <w:spacing w:line="240" w:lineRule="auto" w:after="0"/>
-              <w:jc w:val="left"/>
-            </w:pPr>
-            <w:r>
-              <w:rPr>
-                <w:rFonts w:ascii="Times New Roman" w:hAnsi="Times New Roman"/>
-                <w:sz w:val="20"/>
-              </w:rPr>
-              <w:t xml:space="preserve">Found in the audit</w:t>
-            </w:r>
-          </w:p>
-        </w:tc>
-      </w:tr>
-      <w:tr>
-        <w:tc>
-          <w:tcPr/>
-          <w:p>
-            <w:pPr>
-              <w:pStyle w:val="Compact"/>
-              <w:spacing w:line="240" w:lineRule="auto" w:after="0"/>
-              <w:jc w:val="left"/>
-            </w:pPr>
-            <w:r>
-              <w:rPr>
-                <w:rFonts w:ascii="Times New Roman" w:hAnsi="Times New Roman"/>
-                <w:sz w:val="20"/>
-              </w:rPr>
-              <w:t xml:space="preserve">Stage 2: malignant cells as annotated</w:t>
-            </w:r>
-          </w:p>
-        </w:tc>
-        <w:tc>
-          <w:tcPr/>
-          <w:p>
-            <w:pPr>
-              <w:pStyle w:val="Compact"/>
-              <w:spacing w:line="240" w:lineRule="auto" w:after="0"/>
-              <w:jc w:val="left"/>
-            </w:pPr>
-            <w:r>
-              <w:rPr>
-                <w:rFonts w:ascii="Times New Roman" w:hAnsi="Times New Roman"/>
-                <w:sz w:val="20"/>
-              </w:rPr>
-              <w:t xml:space="preserve">Additional removal of immune cells (PTPRC &gt; 1 or mean macrophage-marker expression &gt; 4; 707 of 5,742 cells)</w:t>
-            </w:r>
-          </w:p>
-        </w:tc>
-        <w:tc>
-          <w:tcPr/>
-          <w:p>
-            <w:pPr>
-              <w:pStyle w:val="Compact"/>
-              <w:spacing w:line="240" w:lineRule="auto" w:after="0"/>
-              <w:jc w:val="left"/>
-            </w:pPr>
-            <w:r>
-              <w:rPr>
-                <w:rFonts w:ascii="Times New Roman" w:hAnsi="Times New Roman"/>
-                <w:sz w:val="20"/>
-              </w:rPr>
-              <w:t xml:space="preserve">Myeloid contamination of the MES-like state</w:t>
-            </w:r>
-          </w:p>
-        </w:tc>
-        <w:tc>
-          <w:tcPr/>
-          <w:p>
-            <w:pPr>
-              <w:pStyle w:val="Compact"/>
-              <w:spacing w:line="240" w:lineRule="auto" w:after="0"/>
-              <w:jc w:val="left"/>
-            </w:pPr>
-            <w:r>
-              <w:rPr>
-                <w:rFonts w:ascii="Times New Roman" w:hAnsi="Times New Roman"/>
-                <w:sz w:val="20"/>
-              </w:rPr>
-              <w:t xml:space="preserve">During analysis</w:t>
-            </w:r>
-          </w:p>
-        </w:tc>
-      </w:tr>
-      <w:tr>
-        <w:tc>
-          <w:tcPr/>
-          <w:p>
-            <w:pPr>
-              <w:pStyle w:val="Compact"/>
-              <w:spacing w:line="240" w:lineRule="auto" w:after="0"/>
-              <w:jc w:val="left"/>
-            </w:pPr>
-            <w:r>
-              <w:rPr>
-                <w:rFonts w:ascii="Times New Roman" w:hAnsi="Times New Roman"/>
-                <w:sz w:val="20"/>
-              </w:rPr>
-              <w:t xml:space="preserve">Stage 2: 24 tumours</w:t>
-            </w:r>
-          </w:p>
-        </w:tc>
-        <w:tc>
-          <w:tcPr/>
-          <w:p>
-            <w:pPr>
-              <w:pStyle w:val="Compact"/>
-              <w:spacing w:line="240" w:lineRule="auto" w:after="0"/>
-              <w:jc w:val="left"/>
-            </w:pPr>
-            <w:r>
-              <w:rPr>
-                <w:rFonts w:ascii="Times New Roman" w:hAnsi="Times New Roman"/>
-                <w:sz w:val="20"/>
-              </w:rPr>
-              <w:t xml:space="preserve">20 tumours (36 pseudobulk samples)</w:t>
-            </w:r>
-          </w:p>
-        </w:tc>
-        <w:tc>
-          <w:tcPr/>
-          <w:p>
-            <w:pPr>
-              <w:pStyle w:val="Compact"/>
-              <w:spacing w:line="240" w:lineRule="auto" w:after="0"/>
-              <w:jc w:val="left"/>
-            </w:pPr>
-            <w:r>
-              <w:rPr>
-                <w:rFonts w:ascii="Times New Roman" w:hAnsi="Times New Roman"/>
-                <w:sz w:val="20"/>
-              </w:rPr>
-              <w:t xml:space="preserve">Minimum-cell filter</w:t>
-            </w:r>
-          </w:p>
-        </w:tc>
-        <w:tc>
-          <w:tcPr/>
-          <w:p>
-            <w:pPr>
-              <w:pStyle w:val="Compact"/>
-              <w:spacing w:line="240" w:lineRule="auto" w:after="0"/>
-              <w:jc w:val="left"/>
-            </w:pPr>
-            <w:r>
-              <w:rPr>
-                <w:rFonts w:ascii="Times New Roman" w:hAnsi="Times New Roman"/>
-                <w:sz w:val="20"/>
-              </w:rPr>
-              <w:t xml:space="preserve">During analysis</w:t>
-            </w:r>
-          </w:p>
-        </w:tc>
-      </w:tr>
-      <w:tr>
-        <w:tc>
-          <w:tcPr/>
-          <w:p>
-            <w:pPr>
-              <w:pStyle w:val="Compact"/>
-              <w:spacing w:line="240" w:lineRule="auto" w:after="0"/>
-              <w:jc w:val="left"/>
-            </w:pPr>
-            <w:r>
-              <w:rPr>
-                <w:rFonts w:ascii="Times New Roman" w:hAnsi="Times New Roman"/>
-                <w:sz w:val="20"/>
-              </w:rPr>
-              <w:t xml:space="preserve">Stage 3, Test 1: BH adjustment at the DU position</w:t>
-            </w:r>
-          </w:p>
-        </w:tc>
-        <w:tc>
-          <w:tcPr/>
-          <w:p>
-            <w:pPr>
-              <w:pStyle w:val="Compact"/>
-              <w:spacing w:line="240" w:lineRule="auto" w:after="0"/>
-              <w:jc w:val="left"/>
-            </w:pPr>
-            <w:r>
-              <w:rPr>
-                <w:rFonts w:ascii="Times New Roman" w:hAnsi="Times New Roman"/>
-                <w:sz w:val="20"/>
-              </w:rPr>
-              <w:t xml:space="preserve">DU position, P multiplied by the number of pixels</w:t>
-            </w:r>
-          </w:p>
-        </w:tc>
-        <w:tc>
-          <w:tcPr/>
-          <w:p>
-            <w:pPr>
-              <w:pStyle w:val="Compact"/>
-              <w:spacing w:line="240" w:lineRule="auto" w:after="0"/>
-              <w:jc w:val="left"/>
-            </w:pPr>
-            <w:r>
-              <w:rPr>
-                <w:rFonts w:ascii="Times New Roman" w:hAnsi="Times New Roman"/>
-                <w:sz w:val="20"/>
-              </w:rPr>
-              <w:t xml:space="preserve">Consistency with the original code (more conservative)</w:t>
-            </w:r>
-          </w:p>
-        </w:tc>
-        <w:tc>
-          <w:tcPr/>
-          <w:p>
-            <w:pPr>
-              <w:pStyle w:val="Compact"/>
-              <w:spacing w:line="240" w:lineRule="auto" w:after="0"/>
-              <w:jc w:val="left"/>
-            </w:pPr>
-            <w:r>
-              <w:rPr>
-                <w:rFonts w:ascii="Times New Roman" w:hAnsi="Times New Roman"/>
-                <w:sz w:val="20"/>
-              </w:rPr>
-              <w:t xml:space="preserve">Before the re-analysis</w:t>
-            </w:r>
-          </w:p>
-        </w:tc>
-      </w:tr>
-      <w:tr>
-        <w:tc>
-          <w:tcPr/>
-          <w:p>
-            <w:pPr>
-              <w:pStyle w:val="Compact"/>
-              <w:spacing w:line="240" w:lineRule="auto" w:after="0"/>
-              <w:jc w:val="left"/>
-            </w:pPr>
-            <w:r>
-              <w:rPr>
-                <w:rFonts w:ascii="Times New Roman" w:hAnsi="Times New Roman"/>
-                <w:sz w:val="20"/>
-              </w:rPr>
-              <w:t xml:space="preserve">Stage 4: bMIND</w:t>
-            </w:r>
-          </w:p>
-        </w:tc>
-        <w:tc>
-          <w:tcPr/>
-          <w:p>
-            <w:pPr>
-              <w:pStyle w:val="Compact"/>
-              <w:spacing w:line="240" w:lineRule="auto" w:after="0"/>
-              <w:jc w:val="left"/>
-            </w:pPr>
-            <w:r>
-              <w:rPr>
-                <w:rFonts w:ascii="Times New Roman" w:hAnsi="Times New Roman"/>
-                <w:sz w:val="20"/>
-              </w:rPr>
-              <w:t xml:space="preserve">MuSiC with an Allen human M1 reference</w:t>
-            </w:r>
-          </w:p>
-        </w:tc>
-        <w:tc>
-          <w:tcPr/>
-          <w:p>
-            <w:pPr>
-              <w:pStyle w:val="Compact"/>
-              <w:spacing w:line="240" w:lineRule="auto" w:after="0"/>
-              <w:jc w:val="left"/>
-            </w:pPr>
-            <w:r>
-              <w:rPr>
-                <w:rFonts w:ascii="Times New Roman" w:hAnsi="Times New Roman"/>
-                <w:sz w:val="20"/>
-              </w:rPr>
-              <w:t xml:space="preserve">Package availability</w:t>
-            </w:r>
-          </w:p>
-        </w:tc>
-        <w:tc>
-          <w:tcPr/>
-          <w:p>
-            <w:pPr>
-              <w:pStyle w:val="Compact"/>
-              <w:spacing w:line="240" w:lineRule="auto" w:after="0"/>
-              <w:jc w:val="left"/>
-            </w:pPr>
-            <w:r>
-              <w:rPr>
-                <w:rFonts w:ascii="Times New Roman" w:hAnsi="Times New Roman"/>
-                <w:sz w:val="20"/>
-              </w:rPr>
-              <w:t xml:space="preserve">Before analysis</w:t>
-            </w:r>
-          </w:p>
-        </w:tc>
-      </w:tr>
-      <w:tr>
-        <w:tc>
-          <w:tcPr/>
-          <w:p>
-            <w:pPr>
-              <w:pStyle w:val="Compact"/>
-              <w:spacing w:line="240" w:lineRule="auto" w:after="0"/>
-              <w:jc w:val="left"/>
-            </w:pPr>
-            <w:r>
-              <w:rPr>
-                <w:rFonts w:ascii="Times New Roman" w:hAnsi="Times New Roman"/>
-                <w:sz w:val="20"/>
-              </w:rPr>
-              <w:t xml:space="preserve">Stage 4: reference cited as Tasic et al. (2018)</w:t>
-            </w:r>
-          </w:p>
-        </w:tc>
-        <w:tc>
-          <w:tcPr/>
-          <w:p>
-            <w:pPr>
-              <w:pStyle w:val="Compact"/>
-              <w:spacing w:line="240" w:lineRule="auto" w:after="0"/>
-              <w:jc w:val="left"/>
-            </w:pPr>
-            <w:r>
-              <w:rPr>
-                <w:rFonts w:ascii="Times New Roman" w:hAnsi="Times New Roman"/>
-                <w:sz w:val="20"/>
-              </w:rPr>
-              <w:t xml:space="preserve">Bakken et al. (2021)</w:t>
-            </w:r>
-          </w:p>
-        </w:tc>
-        <w:tc>
-          <w:tcPr/>
-          <w:p>
-            <w:pPr>
-              <w:pStyle w:val="Compact"/>
-              <w:spacing w:line="240" w:lineRule="auto" w:after="0"/>
-              <w:jc w:val="left"/>
-            </w:pPr>
-            <w:r>
-              <w:rPr>
-                <w:rFonts w:ascii="Times New Roman" w:hAnsi="Times New Roman"/>
-                <w:sz w:val="20"/>
-              </w:rPr>
-              <w:t xml:space="preserve">The plan’s citation refers to mouse data</w:t>
-            </w:r>
-          </w:p>
-        </w:tc>
-        <w:tc>
-          <w:tcPr/>
-          <w:p>
-            <w:pPr>
-              <w:pStyle w:val="Compact"/>
-              <w:spacing w:line="240" w:lineRule="auto" w:after="0"/>
-              <w:jc w:val="left"/>
-            </w:pPr>
-            <w:r>
-              <w:rPr>
-                <w:rFonts w:ascii="Times New Roman" w:hAnsi="Times New Roman"/>
-                <w:sz w:val="20"/>
-              </w:rPr>
-              <w:t xml:space="preserve">Before analysis</w:t>
-            </w:r>
-          </w:p>
-        </w:tc>
-      </w:tr>
-      <w:tr>
-        <w:tc>
-          <w:tcPr/>
-          <w:p>
-            <w:pPr>
-              <w:pStyle w:val="Compact"/>
-              <w:spacing w:line="240" w:lineRule="auto" w:after="0"/>
-              <w:jc w:val="left"/>
-            </w:pPr>
-            <w:r>
-              <w:rPr>
-                <w:rFonts w:ascii="Times New Roman" w:hAnsi="Times New Roman"/>
-                <w:sz w:val="20"/>
-              </w:rPr>
-              <w:t xml:space="preserve">Stage 4: hippocampus and entorhinal cortex in the AD cohort</w:t>
-            </w:r>
-          </w:p>
-        </w:tc>
-        <w:tc>
-          <w:tcPr/>
-          <w:p>
-            <w:pPr>
-              <w:pStyle w:val="Compact"/>
-              <w:spacing w:line="240" w:lineRule="auto" w:after="0"/>
-              <w:jc w:val="left"/>
-            </w:pPr>
-            <w:r>
-              <w:rPr>
-                <w:rFonts w:ascii="Times New Roman" w:hAnsi="Times New Roman"/>
-                <w:sz w:val="20"/>
-              </w:rPr>
-              <w:t xml:space="preserve">Hippocampus only</w:t>
-            </w:r>
-          </w:p>
-        </w:tc>
-        <w:tc>
-          <w:tcPr/>
-          <w:p>
-            <w:pPr>
-              <w:pStyle w:val="Compact"/>
-              <w:spacing w:line="240" w:lineRule="auto" w:after="0"/>
-              <w:jc w:val="left"/>
-            </w:pPr>
-            <w:r>
-              <w:rPr>
-                <w:rFonts w:ascii="Times New Roman" w:hAnsi="Times New Roman"/>
-                <w:sz w:val="20"/>
-              </w:rPr>
-              <w:t xml:space="preserve">Only region shared by both platforms</w:t>
-            </w:r>
-          </w:p>
-        </w:tc>
-        <w:tc>
-          <w:tcPr/>
-          <w:p>
-            <w:pPr>
-              <w:pStyle w:val="Compact"/>
-              <w:spacing w:line="240" w:lineRule="auto" w:after="0"/>
-              <w:jc w:val="left"/>
-            </w:pPr>
-            <w:r>
-              <w:rPr>
-                <w:rFonts w:ascii="Times New Roman" w:hAnsi="Times New Roman"/>
-                <w:sz w:val="20"/>
-              </w:rPr>
-              <w:t xml:space="preserve">Before analysis</w:t>
-            </w:r>
-          </w:p>
-        </w:tc>
-      </w:tr>
-      <w:tr>
-        <w:tc>
-          <w:tcPr/>
-          <w:p>
-            <w:pPr>
-              <w:pStyle w:val="Compact"/>
-              <w:spacing w:line="240" w:lineRule="auto" w:after="0"/>
-              <w:jc w:val="left"/>
-            </w:pPr>
-            <w:r>
-              <w:rPr>
-                <w:rFonts w:ascii="Times New Roman" w:hAnsi="Times New Roman"/>
-                <w:sz w:val="20"/>
-              </w:rPr>
-              <w:t xml:space="preserve">Stage 4: GSE48350 diagnosis field</w:t>
-            </w:r>
-          </w:p>
-        </w:tc>
-        <w:tc>
-          <w:tcPr/>
-          <w:p>
-            <w:pPr>
-              <w:pStyle w:val="Compact"/>
-              <w:spacing w:line="240" w:lineRule="auto" w:after="0"/>
-              <w:jc w:val="left"/>
-            </w:pPr>
-            <w:r>
-              <w:rPr>
-                <w:rFonts w:ascii="Times New Roman" w:hAnsi="Times New Roman"/>
-                <w:sz w:val="20"/>
-              </w:rPr>
-              <w:t xml:space="preserve">Braak-based AD definition</w:t>
-            </w:r>
-          </w:p>
-        </w:tc>
-        <w:tc>
-          <w:tcPr/>
-          <w:p>
-            <w:pPr>
-              <w:pStyle w:val="Compact"/>
-              <w:spacing w:line="240" w:lineRule="auto" w:after="0"/>
-              <w:jc w:val="left"/>
-            </w:pPr>
-            <w:r>
-              <w:rPr>
-                <w:rFonts w:ascii="Times New Roman" w:hAnsi="Times New Roman"/>
-                <w:sz w:val="20"/>
-              </w:rPr>
-              <w:t xml:space="preserve">No diagnosis field in the metadata</w:t>
-            </w:r>
-          </w:p>
-        </w:tc>
-        <w:tc>
-          <w:tcPr/>
-          <w:p>
-            <w:pPr>
-              <w:pStyle w:val="Compact"/>
-              <w:spacing w:line="240" w:lineRule="auto" w:after="0"/>
-              <w:jc w:val="left"/>
-            </w:pPr>
-            <w:r>
-              <w:rPr>
-                <w:rFonts w:ascii="Times New Roman" w:hAnsi="Times New Roman"/>
-                <w:sz w:val="20"/>
-              </w:rPr>
-              <w:t xml:space="preserve">Before analysis</w:t>
-            </w:r>
-          </w:p>
-        </w:tc>
-      </w:tr>
-      <w:tr>
-        <w:tc>
-          <w:tcPr/>
-          <w:p>
-            <w:pPr>
-              <w:pStyle w:val="Compact"/>
-              <w:spacing w:line="240" w:lineRule="auto" w:after="0"/>
-              <w:jc w:val="left"/>
-            </w:pPr>
-            <w:r>
-              <w:rPr>
-                <w:rFonts w:ascii="Times New Roman" w:hAnsi="Times New Roman"/>
-                <w:sz w:val="20"/>
-              </w:rPr>
-              <w:t xml:space="preserve">Stage 4: age ≥ 65 years for GSE48350</w:t>
-            </w:r>
-          </w:p>
-        </w:tc>
-        <w:tc>
-          <w:tcPr/>
-          <w:p>
-            <w:pPr>
-              <w:pStyle w:val="Compact"/>
-              <w:spacing w:line="240" w:lineRule="auto" w:after="0"/>
-              <w:jc w:val="left"/>
-            </w:pPr>
-            <w:r>
-              <w:rPr>
-                <w:rFonts w:ascii="Times New Roman" w:hAnsi="Times New Roman"/>
-                <w:sz w:val="20"/>
-              </w:rPr>
-              <w:t xml:space="preserve">Also applied to GSE36980</w:t>
-            </w:r>
-          </w:p>
-        </w:tc>
-        <w:tc>
-          <w:tcPr/>
-          <w:p>
-            <w:pPr>
-              <w:pStyle w:val="Compact"/>
-              <w:spacing w:line="240" w:lineRule="auto" w:after="0"/>
-              <w:jc w:val="left"/>
-            </w:pPr>
-            <w:r>
-              <w:rPr>
-                <w:rFonts w:ascii="Times New Roman" w:hAnsi="Times New Roman"/>
-                <w:sz w:val="20"/>
-              </w:rPr>
-              <w:t xml:space="preserve">Consistency between datasets; one control aged 55 excluded</w:t>
-            </w:r>
-          </w:p>
-        </w:tc>
-        <w:tc>
-          <w:tcPr/>
-          <w:p>
-            <w:pPr>
-              <w:pStyle w:val="Compact"/>
-              <w:spacing w:line="240" w:lineRule="auto" w:after="0"/>
-              <w:jc w:val="left"/>
-            </w:pPr>
-            <w:r>
-              <w:rPr>
-                <w:rFonts w:ascii="Times New Roman" w:hAnsi="Times New Roman"/>
-                <w:sz w:val="20"/>
-              </w:rPr>
-              <w:t xml:space="preserve">Found when checking sample counts against the source publication</w:t>
-            </w:r>
-          </w:p>
-        </w:tc>
-      </w:tr>
-      <w:tr>
-        <w:tc>
-          <w:tcPr/>
-          <w:p>
-            <w:pPr>
-              <w:pStyle w:val="Compact"/>
-              <w:spacing w:line="240" w:lineRule="auto" w:after="0"/>
-              <w:jc w:val="left"/>
-            </w:pPr>
-            <w:r>
-              <w:rPr>
-                <w:rFonts w:ascii="Times New Roman" w:hAnsi="Times New Roman"/>
-                <w:sz w:val="20"/>
-              </w:rPr>
-              <w:t xml:space="preserve">Stage 4: ComBat preserves diagnosis and brain region</w:t>
-            </w:r>
-          </w:p>
-        </w:tc>
-        <w:tc>
-          <w:tcPr/>
-          <w:p>
-            <w:pPr>
-              <w:pStyle w:val="Compact"/>
-              <w:spacing w:line="240" w:lineRule="auto" w:after="0"/>
-              <w:jc w:val="left"/>
-            </w:pPr>
-            <w:r>
-              <w:rPr>
-                <w:rFonts w:ascii="Times New Roman" w:hAnsi="Times New Roman"/>
-                <w:sz w:val="20"/>
-              </w:rPr>
-              <w:t xml:space="preserve">Diagnosis and sex preserved</w:t>
-            </w:r>
-          </w:p>
-        </w:tc>
-        <w:tc>
-          <w:tcPr/>
-          <w:p>
-            <w:pPr>
-              <w:pStyle w:val="Compact"/>
-              <w:spacing w:line="240" w:lineRule="auto" w:after="0"/>
-              <w:jc w:val="left"/>
-            </w:pPr>
-            <w:r>
-              <w:rPr>
-                <w:rFonts w:ascii="Times New Roman" w:hAnsi="Times New Roman"/>
-                <w:sz w:val="20"/>
-              </w:rPr>
-              <w:t xml:space="preserve">Region has one level; sex was among the candidate covariates in the code</w:t>
-            </w:r>
-          </w:p>
-        </w:tc>
-        <w:tc>
-          <w:tcPr/>
-          <w:p>
-            <w:pPr>
-              <w:pStyle w:val="Compact"/>
-              <w:spacing w:line="240" w:lineRule="auto" w:after="0"/>
-              <w:jc w:val="left"/>
-            </w:pPr>
-            <w:r>
-              <w:rPr>
-                <w:rFonts w:ascii="Times New Roman" w:hAnsi="Times New Roman"/>
-                <w:sz w:val="20"/>
-              </w:rPr>
-              <w:t xml:space="preserve">Before analysis (in code)</w:t>
-            </w:r>
-          </w:p>
-        </w:tc>
-      </w:tr>
-      <w:tr>
-        <w:tc>
-          <w:tcPr/>
-          <w:p>
-            <w:pPr>
-              <w:pStyle w:val="Compact"/>
-              <w:spacing w:line="240" w:lineRule="auto" w:after="0"/>
-              <w:jc w:val="left"/>
-            </w:pPr>
-            <w:r>
-              <w:rPr>
-                <w:rFonts w:ascii="Times New Roman" w:hAnsi="Times New Roman"/>
-                <w:sz w:val="20"/>
-              </w:rPr>
-              <w:t xml:space="preserve">Stage 4: brain region in Model A</w:t>
-            </w:r>
-          </w:p>
-        </w:tc>
-        <w:tc>
-          <w:tcPr/>
-          <w:p>
-            <w:pPr>
-              <w:pStyle w:val="Compact"/>
-              <w:spacing w:line="240" w:lineRule="auto" w:after="0"/>
-              <w:jc w:val="left"/>
-            </w:pPr>
-            <w:r>
-              <w:rPr>
-                <w:rFonts w:ascii="Times New Roman" w:hAnsi="Times New Roman"/>
-                <w:sz w:val="20"/>
-              </w:rPr>
-              <w:t xml:space="preserve">Removed</w:t>
-            </w:r>
-          </w:p>
-        </w:tc>
-        <w:tc>
-          <w:tcPr/>
-          <w:p>
-            <w:pPr>
-              <w:pStyle w:val="Compact"/>
-              <w:spacing w:line="240" w:lineRule="auto" w:after="0"/>
-              <w:jc w:val="left"/>
-            </w:pPr>
-            <w:r>
-              <w:rPr>
-                <w:rFonts w:ascii="Times New Roman" w:hAnsi="Times New Roman"/>
-                <w:sz w:val="20"/>
-              </w:rPr>
-              <w:t xml:space="preserve">One level in AD; confounded with diagnosis in GBM</w:t>
-            </w:r>
-          </w:p>
-        </w:tc>
-        <w:tc>
-          <w:tcPr/>
-          <w:p>
-            <w:pPr>
-              <w:pStyle w:val="Compact"/>
-              <w:spacing w:line="240" w:lineRule="auto" w:after="0"/>
-              <w:jc w:val="left"/>
-            </w:pPr>
-            <w:r>
-              <w:rPr>
-                <w:rFonts w:ascii="Times New Roman" w:hAnsi="Times New Roman"/>
-                <w:sz w:val="20"/>
-              </w:rPr>
-              <w:t xml:space="preserve">Before analysis</w:t>
-            </w:r>
-          </w:p>
-        </w:tc>
-      </w:tr>
-      <w:tr>
-        <w:tc>
-          <w:tcPr/>
-          <w:p>
-            <w:pPr>
-              <w:pStyle w:val="Compact"/>
-              <w:spacing w:line="240" w:lineRule="auto" w:after="0"/>
-              <w:jc w:val="left"/>
-            </w:pPr>
-            <w:r>
-              <w:rPr>
-                <w:rFonts w:ascii="Times New Roman" w:hAnsi="Times New Roman"/>
-                <w:sz w:val="20"/>
-              </w:rPr>
-              <w:t xml:space="preserve">Stage 4: GTEx exclusion for RIN &lt; 6 and Hardy &gt; 3</w:t>
-            </w:r>
-          </w:p>
-        </w:tc>
-        <w:tc>
-          <w:tcPr/>
-          <w:p>
-            <w:pPr>
-              <w:pStyle w:val="Compact"/>
-              <w:spacing w:line="240" w:lineRule="auto" w:after="0"/>
-              <w:jc w:val="left"/>
-            </w:pPr>
-            <w:r>
-              <w:rPr>
-                <w:rFonts w:ascii="Times New Roman" w:hAnsi="Times New Roman"/>
-                <w:sz w:val="20"/>
-              </w:rPr>
-              <w:t xml:space="preserve">Not applied</w:t>
-            </w:r>
-          </w:p>
-        </w:tc>
-        <w:tc>
-          <w:tcPr/>
-          <w:p>
-            <w:pPr>
-              <w:pStyle w:val="Compact"/>
-              <w:spacing w:line="240" w:lineRule="auto" w:after="0"/>
-              <w:jc w:val="left"/>
-            </w:pPr>
-            <w:r>
-              <w:rPr>
-                <w:rFonts w:ascii="Times New Roman" w:hAnsi="Times New Roman"/>
-                <w:sz w:val="20"/>
-              </w:rPr>
-              <w:t xml:space="preserve">Fields absent from the Xena phenotype file</w:t>
-            </w:r>
-          </w:p>
-        </w:tc>
-        <w:tc>
-          <w:tcPr/>
-          <w:p>
-            <w:pPr>
-              <w:pStyle w:val="Compact"/>
-              <w:spacing w:line="240" w:lineRule="auto" w:after="0"/>
-              <w:jc w:val="left"/>
-            </w:pPr>
-            <w:r>
-              <w:rPr>
-                <w:rFonts w:ascii="Times New Roman" w:hAnsi="Times New Roman"/>
-                <w:sz w:val="20"/>
-              </w:rPr>
-              <w:t xml:space="preserve">Before analysis</w:t>
-            </w:r>
-          </w:p>
-        </w:tc>
-      </w:tr>
-      <w:tr>
-        <w:tc>
-          <w:tcPr/>
-          <w:p>
-            <w:pPr>
-              <w:pStyle w:val="Compact"/>
-              <w:spacing w:line="240" w:lineRule="auto" w:after="0"/>
-              <w:jc w:val="left"/>
-            </w:pPr>
-            <w:r>
-              <w:rPr>
-                <w:rFonts w:ascii="Times New Roman" w:hAnsi="Times New Roman"/>
-                <w:sz w:val="20"/>
-              </w:rPr>
-              <w:t xml:space="preserve">Stage 4: H1 set aside (register entry of 22 September)</w:t>
-            </w:r>
-          </w:p>
-        </w:tc>
-        <w:tc>
-          <w:tcPr/>
-          <w:p>
-            <w:pPr>
-              <w:pStyle w:val="Compact"/>
-              <w:spacing w:line="240" w:lineRule="auto" w:after="0"/>
-              <w:jc w:val="left"/>
-            </w:pPr>
-            <w:r>
-              <w:rPr>
-                <w:rFonts w:ascii="Times New Roman" w:hAnsi="Times New Roman"/>
-                <w:sz w:val="20"/>
-              </w:rPr>
-              <w:t xml:space="preserve">H1 tested as planned</w:t>
-            </w:r>
-          </w:p>
-        </w:tc>
-        <w:tc>
-          <w:tcPr/>
-          <w:p>
-            <w:pPr>
-              <w:pStyle w:val="Compact"/>
-              <w:spacing w:line="240" w:lineRule="auto" w:after="0"/>
-              <w:jc w:val="left"/>
-            </w:pPr>
-            <w:r>
-              <w:rPr>
-                <w:rFonts w:ascii="Times New Roman" w:hAnsi="Times New Roman"/>
-                <w:sz w:val="20"/>
-              </w:rPr>
-              <w:t xml:space="preserve">The stated reason (data access agreement) was wrong</w:t>
-            </w:r>
-          </w:p>
-        </w:tc>
-        <w:tc>
-          <w:tcPr/>
-          <w:p>
-            <w:pPr>
-              <w:pStyle w:val="Compact"/>
-              <w:spacing w:line="240" w:lineRule="auto" w:after="0"/>
-              <w:jc w:val="left"/>
-            </w:pPr>
-            <w:r>
-              <w:rPr>
-                <w:rFonts w:ascii="Times New Roman" w:hAnsi="Times New Roman"/>
-                <w:sz w:val="20"/>
-              </w:rPr>
-              <w:t xml:space="preserve">Found in the audit</w:t>
-            </w:r>
-          </w:p>
-        </w:tc>
-      </w:tr>
-      <w:tr>
-        <w:tc>
-          <w:tcPr/>
-          <w:p>
-            <w:pPr>
-              <w:pStyle w:val="Compact"/>
-              <w:spacing w:line="240" w:lineRule="auto" w:after="0"/>
-              <w:jc w:val="left"/>
-            </w:pPr>
-            <w:r>
-              <w:rPr>
-                <w:rFonts w:ascii="Times New Roman" w:hAnsi="Times New Roman"/>
-                <w:sz w:val="20"/>
-              </w:rPr>
-              <w:t xml:space="preserve">Title (plan section 12.2)</w:t>
-            </w:r>
-          </w:p>
-        </w:tc>
-        <w:tc>
-          <w:tcPr/>
-          <w:p>
-            <w:pPr>
-              <w:pStyle w:val="Compact"/>
-              <w:spacing w:line="240" w:lineRule="auto" w:after="0"/>
-              <w:jc w:val="left"/>
-            </w:pPr>
-            <w:r>
-              <w:rPr>
-                <w:rFonts w:ascii="Times New Roman" w:hAnsi="Times New Roman"/>
-                <w:sz w:val="20"/>
-              </w:rPr>
-              <w:t xml:space="preserve">Shortened; H2 clause removed;</w:t>
-            </w:r>
-            <w:r>
-              <w:rPr>
-                <w:rFonts w:ascii="Times New Roman" w:hAnsi="Times New Roman"/>
-                <w:sz w:val="20"/>
-              </w:rPr>
-              <w:t xml:space="preserve"> </w:t>
-            </w:r>
-            <w:r>
-              <w:rPr>
-                <w:rFonts w:ascii="Times New Roman" w:hAnsi="Times New Roman"/>
-                <w:sz w:val="20"/>
-              </w:rPr>
-              <w:t xml:space="preserve">‘</w:t>
-            </w:r>
-            <w:r>
-              <w:rPr>
-                <w:rFonts w:ascii="Times New Roman" w:hAnsi="Times New Roman"/>
-                <w:sz w:val="20"/>
-              </w:rPr>
-              <w:t xml:space="preserve">markedly reduced after adjustment for estimated cell composition</w:t>
-            </w:r>
-            <w:r>
-              <w:rPr>
-                <w:rFonts w:ascii="Times New Roman" w:hAnsi="Times New Roman"/>
-                <w:sz w:val="20"/>
-              </w:rPr>
-              <w:t xml:space="preserve">’</w:t>
-            </w:r>
-          </w:p>
-        </w:tc>
-        <w:tc>
-          <w:tcPr/>
-          <w:p>
-            <w:pPr>
-              <w:pStyle w:val="Compact"/>
-              <w:spacing w:line="240" w:lineRule="auto" w:after="0"/>
-              <w:jc w:val="left"/>
-            </w:pPr>
-            <w:r>
-              <w:rPr>
-                <w:rFonts w:ascii="Times New Roman" w:hAnsi="Times New Roman"/>
-                <w:sz w:val="20"/>
-              </w:rPr>
-              <w:t xml:space="preserve">Length; the H2 clause claimed more than a 6-donor analysis can support; composition specificity not shown; 288 shared DEGs remained in the replication cohort</w:t>
-            </w:r>
-          </w:p>
-        </w:tc>
-        <w:tc>
-          <w:tcPr/>
-          <w:p>
-            <w:pPr>
-              <w:pStyle w:val="Compact"/>
-              <w:spacing w:line="240" w:lineRule="auto" w:after="0"/>
-              <w:jc w:val="left"/>
-            </w:pPr>
-            <w:r>
-              <w:rPr>
-                <w:rFonts w:ascii="Times New Roman" w:hAnsi="Times New Roman"/>
-                <w:sz w:val="20"/>
-              </w:rPr>
-              <w:t xml:space="preserve">After results</w:t>
-            </w:r>
-          </w:p>
-        </w:tc>
-      </w:tr>
-      <w:tr>
-        <w:tc>
-          <w:tcPr/>
-          <w:p>
-            <w:pPr>
-              <w:pStyle w:val="Compact"/>
-              <w:spacing w:line="240" w:lineRule="auto" w:after="0"/>
-              <w:jc w:val="left"/>
-            </w:pPr>
-            <w:r>
-              <w:rPr>
-                <w:rFonts w:ascii="Times New Roman" w:hAnsi="Times New Roman"/>
-                <w:sz w:val="20"/>
-              </w:rPr>
-              <w:t xml:space="preserve">Not in the plan</w:t>
-            </w:r>
-          </w:p>
-        </w:tc>
-        <w:tc>
-          <w:tcPr/>
-          <w:p>
-            <w:pPr>
-              <w:pStyle w:val="Compact"/>
-              <w:spacing w:line="240" w:lineRule="auto" w:after="0"/>
-              <w:jc w:val="left"/>
-            </w:pPr>
-            <w:r>
-              <w:rPr>
-                <w:rFonts w:ascii="Times New Roman" w:hAnsi="Times New Roman"/>
-                <w:sz w:val="20"/>
-              </w:rPr>
-              <w:t xml:space="preserve">H1 replication in GSE125583; 2 × 2 DD decomposition; GBM limma-trend sensitivity</w:t>
-            </w:r>
-          </w:p>
-        </w:tc>
-        <w:tc>
-          <w:tcPr/>
-          <w:p>
-            <w:pPr>
-              <w:pStyle w:val="Compact"/>
-              <w:spacing w:line="240" w:lineRule="auto" w:after="0"/>
-              <w:jc w:val="left"/>
-            </w:pPr>
-            <w:r>
-              <w:rPr>
-                <w:rFonts w:ascii="Times New Roman" w:hAnsi="Times New Roman"/>
-                <w:sz w:val="20"/>
-              </w:rPr>
-              <w:t xml:space="preserve">External review</w:t>
-            </w:r>
-          </w:p>
-        </w:tc>
-        <w:tc>
-          <w:tcPr/>
-          <w:p>
-            <w:pPr>
-              <w:pStyle w:val="Compact"/>
-              <w:spacing w:line="240" w:lineRule="auto" w:after="0"/>
-              <w:jc w:val="left"/>
-            </w:pPr>
-            <w:r>
-              <w:rPr>
-                <w:rFonts w:ascii="Times New Roman" w:hAnsi="Times New Roman"/>
-                <w:sz w:val="20"/>
-              </w:rPr>
-              <w:t xml:space="preserve">Pre-declared before running</w:t>
-            </w:r>
-          </w:p>
-        </w:tc>
-      </w:tr>
-      <w:tr>
-        <w:tc>
-          <w:tcPr/>
-          <w:p>
-            <w:pPr>
-              <w:pStyle w:val="Compact"/>
-              <w:spacing w:line="240" w:lineRule="auto" w:after="0"/>
-              <w:jc w:val="left"/>
-            </w:pPr>
-            <w:r>
-              <w:rPr>
-                <w:rFonts w:ascii="Times New Roman" w:hAnsi="Times New Roman"/>
-                <w:sz w:val="20"/>
-              </w:rPr>
-              <w:t xml:space="preserve">GSE125583 age and sex attached to samples by identifier</w:t>
-            </w:r>
-          </w:p>
-        </w:tc>
-        <w:tc>
-          <w:tcPr/>
-          <w:p>
-            <w:pPr>
-              <w:pStyle w:val="Compact"/>
-              <w:spacing w:line="240" w:lineRule="auto" w:after="0"/>
-              <w:jc w:val="left"/>
-            </w:pPr>
-            <w:r>
-              <w:rPr>
-                <w:rFonts w:ascii="Times New Roman" w:hAnsi="Times New Roman"/>
-                <w:sz w:val="20"/>
-              </w:rPr>
-              <w:t xml:space="preserve">First version attached them by position (58 of 195 sexes and 100 of 195 ages misassigned); corrected</w:t>
-            </w:r>
-          </w:p>
-        </w:tc>
-        <w:tc>
-          <w:tcPr/>
-          <w:p>
-            <w:pPr>
-              <w:pStyle w:val="Compact"/>
-              <w:spacing w:line="240" w:lineRule="auto" w:after="0"/>
-              <w:jc w:val="left"/>
-            </w:pPr>
-            <w:r>
-              <w:rPr>
-                <w:rFonts w:ascii="Times New Roman" w:hAnsi="Times New Roman"/>
-                <w:sz w:val="20"/>
-              </w:rPr>
-              <w:t xml:space="preserve">Found when the cohort was rebuilt from public data</w:t>
-            </w:r>
-          </w:p>
-        </w:tc>
-        <w:tc>
-          <w:tcPr/>
-          <w:p>
-            <w:pPr>
-              <w:pStyle w:val="Compact"/>
-              <w:spacing w:line="240" w:lineRule="auto" w:after="0"/>
-              <w:jc w:val="left"/>
-            </w:pPr>
-            <w:r>
-              <w:rPr>
-                <w:rFonts w:ascii="Times New Roman" w:hAnsi="Times New Roman"/>
-                <w:sz w:val="20"/>
-              </w:rPr>
-              <w:t xml:space="preserve">Correction declared before re-running</w:t>
-            </w:r>
-          </w:p>
-        </w:tc>
-      </w:tr>
-      <w:tr>
-        <w:tc>
-          <w:tcPr/>
-          <w:p>
-            <w:pPr>
-              <w:pStyle w:val="Compact"/>
-              <w:spacing w:line="240" w:lineRule="auto" w:after="0"/>
-              <w:jc w:val="left"/>
-            </w:pPr>
-            <w:r>
-              <w:rPr>
-                <w:rFonts w:ascii="Times New Roman" w:hAnsi="Times New Roman"/>
-                <w:sz w:val="20"/>
-              </w:rPr>
-              <w:t xml:space="preserve">Not in the plan</w:t>
-            </w:r>
-          </w:p>
-        </w:tc>
-        <w:tc>
-          <w:tcPr/>
-          <w:p>
-            <w:pPr>
-              <w:pStyle w:val="Compact"/>
-              <w:spacing w:line="240" w:lineRule="auto" w:after="0"/>
-              <w:jc w:val="left"/>
-            </w:pPr>
-            <w:r>
-              <w:rPr>
-                <w:rFonts w:ascii="Times New Roman" w:hAnsi="Times New Roman"/>
-                <w:sz w:val="20"/>
-              </w:rPr>
-              <w:t xml:space="preserve">GSE125583 cohort</w:t>
-            </w:r>
-          </w:p>
-        </w:tc>
-        <w:tc>
-          <w:tcPr/>
-          <w:p>
-            <w:pPr>
-              <w:pStyle w:val="Compact"/>
-              <w:spacing w:line="240" w:lineRule="auto" w:after="0"/>
-              <w:jc w:val="left"/>
-            </w:pPr>
-            <w:r>
-              <w:rPr>
-                <w:rFonts w:ascii="Times New Roman" w:hAnsi="Times New Roman"/>
-                <w:sz w:val="20"/>
-              </w:rPr>
-              <w:t xml:space="preserve">Exploratory only</w:t>
-            </w:r>
-          </w:p>
-        </w:tc>
-        <w:tc>
-          <w:tcPr/>
-          <w:p>
-            <w:pPr>
-              <w:pStyle w:val="Compact"/>
-              <w:spacing w:line="240" w:lineRule="auto" w:after="0"/>
-              <w:jc w:val="left"/>
-            </w:pPr>
-            <w:r>
-              <w:rPr>
-                <w:rFonts w:ascii="Times New Roman" w:hAnsi="Times New Roman"/>
-                <w:sz w:val="20"/>
-              </w:rPr>
-              <w:t xml:space="preserve">Labelled as exploratory</w:t>
-            </w:r>
-          </w:p>
-        </w:tc>
-      </w:tr>
-    </w:tbl>
-    <w:p>
-      <w:pPr>
-        <w:pStyle w:val="BodyText"/>
-      </w:pPr>
-      <w:r>
-        <w:rPr>
-          <w:iCs/>
-          <w:i/>
-        </w:rPr>
-        <w:t xml:space="preserve">Abbreviations:</w:t>
-      </w:r>
-      <w:r>
-        <w:t xml:space="preserve"> </w:t>
-      </w:r>
-      <w:r>
-        <w:t xml:space="preserve">BH, Benjamini-Hochberg; DD, down in both diseases; DU, down in AD and up in GBM; GBM, glioblastoma; GTEx, Genotype-Tissue Expression project; RIN, RNA integrity number; RORB, RAR-related orphan receptor B; TOIL, the Toil recompute of TCGA and GTEx.</w:t>
-      </w:r>
-    </w:p>
-    <w:bookmarkEnd w:id="30"/>
-    <w:bookmarkEnd w:id="31"/>
-    <w:bookmarkStart w:id="38" w:name="results"/>
-    <w:p>
-      <w:pPr>
-        <w:pStyle w:val="Heading2"/>
-      </w:pPr>
-      <w:r>
-        <w:t xml:space="preserve">3. Results</w:t>
-      </w:r>
-    </w:p>
-    <w:p>
-      <w:pPr>
-        <w:pStyle w:val="FirstParagraph"/>
-      </w:pPr>
-      <w:r>
-        <w:t xml:space="preserve">The tests of the two pre-specified hypotheses are reported first (Sections 3.1–3.3), followed by the exploratory analyses, which do not enter the hypothesis decisions (Sections 3.4–3.6). All numbers come from the facts sheet generated from the locked result files.</w:t>
-      </w:r>
-    </w:p>
-    <w:bookmarkStart w:id="32" w:name="X68c9f0b60a362206b7b8bb2369086a73b9de177"/>
-    <w:p>
-      <w:pPr>
-        <w:pStyle w:val="Heading3"/>
-      </w:pPr>
-      <w:r>
-        <w:t xml:space="preserve">3.1 H1: shared DEGs are lost after adjustment for estimated cell composition</w:t>
-      </w:r>
-    </w:p>
-    <w:p>
-      <w:pPr>
-        <w:pStyle w:val="FirstParagraph"/>
-      </w:pPr>
-      <w:r>
-        <w:t xml:space="preserve">In the hippocampal AD meta-cohort (n = 51; 18 AD, 33 controls) and the TCGA-GBM/GTEx cohort (n = 338; 152 tumours, 186 controls), Model A without composition control gave 4,449 DEGs for AD and 14,811 for GBM at FDR &lt; 0.05 (Figure 2A). Of these, 1,458 genes differed in the same direction in both cohorts (Table 3; the full list, with estimates under every model, is in Supplementary Table S1a).</w:t>
-      </w:r>
-    </w:p>
-    <w:p>
-      <w:pPr>
-        <w:pStyle w:val="BodyText"/>
-      </w:pPr>
-      <w:r>
-        <w:t xml:space="preserve">Adding composition covariates reduced the number of shared DEGs to zero with both deconvolution methods (Model B, BRETIGEA: 0; Model C, MuSiC: 0; Figure 2C). Both ratios to Model A were 0.000, below the pre-specified threshold of 0.20, so H1 was supported under the plan’s decision rule. The result did not change in any of the pre-specified sensitivity analyses. With the fold-change threshold (413 shared DEGs under Model A), with controls restricted to BA9 (1,587) or to the hippocampus (1,240), and with the fold-change threshold applied to single-region controls (BA9: 485; hippocampus: 340), Models B and C gave zero shared DEGs in every case (Figure 2C). The exploratory Model D, with both sets of covariates, also gave none.</w:t>
-      </w:r>
-    </w:p>
-    <w:p>
-      <w:pPr>
-        <w:pStyle w:val="BodyText"/>
-      </w:pPr>
-      <w:r>
-        <w:rPr>
-          <w:bCs/>
-          <w:b/>
-        </w:rPr>
-        <w:t xml:space="preserve">Table 3.</w:t>
       </w:r>
       <w:r>
         <w:t xml:space="preserve"> </w:t>
@@ -3949,7 +2300,7 @@
         <w:pStyle w:val="BodyText"/>
       </w:pPr>
       <w:r>
-        <w:t xml:space="preserve">Because the signature was empty, Stage 3 was run as the plan describes: on the full ranked gene lists (RRHO2) and on the top 200 genes of the ranking (hypergeometric and permutation tests). Running the implementation on the original Stage 1 input reproduced the original result exactly (highest value on the RRHO2 map: 6.54, row 35, column 38). Table 4 summarises the results and Figure 3 shows the RRHO2 maps; the maxima, positions and boundaries of all four quadrants in every analysis are given in Supplementary Table S3.</w:t>
+        <w:t xml:space="preserve">Because the signature was empty, Stage 3 was run as the plan describes: on the full ranked gene lists (RRHO2) and on the top 200 genes of the ranking (hypergeometric and permutation tests). Running the implementation on the original Stage 1 input reproduced the original result exactly (highest value on the RRHO2 map: 6.54, row 35, column 38). Table 3 summarises the results and Figure 3 shows the RRHO2 maps; the maxima, positions and boundaries of all four quadrants in every analysis are given in Supplementary Table S3.</w:t>
       </w:r>
     </w:p>
     <w:p>
@@ -3961,7 +2312,7 @@
           <w:bCs/>
           <w:b/>
         </w:rPr>
-        <w:t xml:space="preserve">Table 4.</w:t>
+        <w:t xml:space="preserve">Table 3.</w:t>
       </w:r>
       <w:r>
         <w:t xml:space="preserve"> </w:t>
@@ -4466,7 +2817,7 @@
         <w:pStyle w:val="BodyText"/>
       </w:pPr>
       <w:r>
-        <w:t xml:space="preserve">None of the three tests passed in the plan-conformant analysis, and H2 was rejected. The documented Braak II deviation and the original implementation give the same answer. In the original implementation, the strong signal on the RRHO2 map (adjusted P = 5.3 × 10⁻⁴) sits not in the DU quadrant required by the plan but in the quadrant of genes down in both diseases (DD; Figure 3, left panel). Since the plan requires Test 1 to be judged in the DU quadrant, the original H2 evaluation also passed none of the three tests, not one of three as an earlier register entry stated.</w:t>
+        <w:t xml:space="preserve">None of the three tests passed in the plan-conformant analysis, and H2 was rejected. The documented Braak II deviation and the original implementation give the same answer. In the original implementation, the strong signal on the RRHO2 map (adjusted P = 5.3 × 10⁻⁴) sits not in the DU quadrant required by the plan but in the quadrant of genes down in both diseases (DD; Figure 3, left panel). Since the plan requires Test 1 to be judged in the DU quadrant, the original H2 evaluation also passed none of the three tests.</w:t>
       </w:r>
     </w:p>
     <w:p>
@@ -4576,7 +2927,7 @@
         <w:pStyle w:val="FirstParagraph"/>
       </w:pPr>
       <w:r>
-        <w:t xml:space="preserve">The original Stage 1 implementation departed from the plan in three ways: it treated three subclusters from the same donor as independent samples (21 samples from seven donors), it left out the age covariate required by the plan, and it used Braak II versus Braak 0 as the primary contrast. It produced 486 significant genes and a visible signal in the DD quadrant in Stage 3 (Table 4, last row). The dependence of this signal and of the gene counts on those analytic choices was examined (Figure 5).</w:t>
+        <w:t xml:space="preserve">The original Stage 1 implementation departed from the plan in three ways: it treated three subclusters from the same donor as independent samples (21 samples from seven donors), it left out the age covariate required by the plan, and it used Braak II versus Braak 0 as the primary contrast. It produced 486 significant genes and a visible signal in the DD quadrant in Stage 3 (Table 3, last row). The dependence of this signal and of the gene counts on those analytic choices was examined (Figure 5).</w:t>
       </w:r>
     </w:p>
     <w:p>
@@ -4612,7 +2963,7 @@
         <w:t xml:space="preserve"> </w:t>
       </w:r>
       <w:r>
-        <w:t xml:space="preserve">The four-quadrant overlap test was repeated at four thresholds fixed in advance (top 100, 200, 300 and 500 genes), using both the original ranking and a donor-level ranking from limma-voom with a donor block (Table 5; Figure 5C). With the original ranking, the DD quadrant was significant at three of the four thresholds (BH-adjusted P &lt; 0.05); with the donor-block ranking, it was significant at only one (top 300 genes). The DU quadrant was significant at three thresholds with the donor-level ranking, but its highest odds ratio (2.42 for the top 200 genes) stayed below the pre-specified H2 threshold of 3. That the DD and DU quadrants are enriched at the same time suggests that genes down in AD are over-represented at both ends of the GBM ranking. This pattern may reflect genes that tend to take extreme values in both datasets, not a directional convergence.</w:t>
+        <w:t xml:space="preserve">The four-quadrant overlap test was repeated at four thresholds fixed in advance (top 100, 200, 300 and 500 genes), using both the original ranking and a donor-level ranking from limma-voom with a donor block (Table 4; Figure 5C). With the original ranking, the DD quadrant was significant at three of the four thresholds (BH-adjusted P &lt; 0.05); with the donor-block ranking, it was significant at only one (top 300 genes). The DU quadrant was significant at three thresholds with the donor-level ranking, but its highest odds ratio (2.42 for the top 200 genes) stayed below the pre-specified H2 threshold of 3. That the DD and DU quadrants are enriched at the same time suggests that genes down in AD are over-represented at both ends of the GBM ranking. This pattern may reflect genes that tend to take extreme values in both datasets, not a directional convergence.</w:t>
       </w:r>
     </w:p>
     <w:p>
@@ -4624,7 +2975,7 @@
           <w:bCs/>
           <w:b/>
         </w:rPr>
-        <w:t xml:space="preserve">Table 5.</w:t>
+        <w:t xml:space="preserve">Table 4.</w:t>
       </w:r>
       <w:r>
         <w:t xml:space="preserve"> </w:t>
@@ -5152,7 +3503,7 @@
         <w:t xml:space="preserve"> </w:t>
       </w:r>
       <w:r>
-        <w:t xml:space="preserve">To separate the two corrections, the Braak II versus Braak 0 contrast was held fixed while donor modelling and age were varied independently (Table 6; Supplementary Table S3). Modelling donor on its own did not remove the DD signal; with donor-summed counts it was, if anything, slightly stronger (RRHO2 DD maximum 7.25; top-200 overlap 21 against 10.4 expected, P = 0.001). Adding age removed it whether or not donor was modelled (DD maximum 1.29 and 1.48; overlaps 9 and 8). The weakening seen with the donor-block ranking in Table 5 is therefore specific to that method. What removes the DD signal is the age term.</w:t>
+        <w:t xml:space="preserve">To separate the two corrections, the Braak II versus Braak 0 contrast was held fixed while donor modelling and age were varied independently (Table 5; Supplementary Table S3). Modelling donor on its own did not remove the DD signal; with donor-summed counts it was, if anything, slightly stronger (RRHO2 DD maximum 7.25; top-200 overlap 21 against 10.4 expected, P = 0.001). Adding age removed it whether or not donor was modelled (DD maximum 1.29 and 1.48; overlaps 9 and 8). The weakening seen with the donor-block ranking in Table 4 is therefore specific to that method. What removes the DD signal is the age term.</w:t>
       </w:r>
     </w:p>
     <w:p>
@@ -5164,7 +3515,7 @@
           <w:bCs/>
           <w:b/>
         </w:rPr>
-        <w:t xml:space="preserve">Table 6.</w:t>
+        <w:t xml:space="preserve">Table 5.</w:t>
       </w:r>
       <w:r>
         <w:t xml:space="preserve"> </w:t>
@@ -5690,7 +4041,7 @@
         <w:pStyle w:val="BodyText"/>
       </w:pPr>
       <w:r>
-        <w:t xml:space="preserve">Pseudoreplication matters for a different reason. It inflated the number of significant genes from 0–27 to 486, and as recorded in the register, adding age to the pseudoreplicated design brought that number down to 3. The raw condition number reported for that model (951) was inflated by the unscaled age variable; the standardised condition number is 3. The problem in the Leng cohort is not numerical singularity but the lack of age overlap combined with the small number of donors.</w:t>
+        <w:t xml:space="preserve">Pseudoreplication matters for a different reason. It inflated the number of significant genes from 0–27 to 486, and adding age to the pseudoreplicated design brought that number down to 3. The raw condition number reported for that model (951) was inflated by the unscaled age variable; the standardised condition number is 3. The problem in the Leng cohort is not numerical singularity but the lack of age overlap combined with the small number of donors.</w:t>
       </w:r>
     </w:p>
     <w:bookmarkEnd w:id="36"/>
@@ -5708,7 +4059,7 @@
         <w:pStyle w:val="FirstParagraph"/>
       </w:pPr>
       <w:r>
-        <w:t xml:space="preserve">Six stress genes taken from the original DD quadrant (CEBPD, FLNA, JUNB, PER1, PFKFB3 and ZFP36L1) were examined in an AD cohort that is not part of the plan (GSE125583, fusiform cortex; 125 advanced AD, 70 controls). The advanced AD group was younger than the controls (median 84 versus 87 years; correlation between group and age r = −0.27; Wilcoxon P = 4.7 × 10⁻⁴), so age was included in every model.</w:t>
+        <w:t xml:space="preserve">Six stress genes taken from the original DD quadrant (CEBPD, FLNA, JUNB, PER1, PFKFB3 and ZFP36L1) were examined in an AD cohort that is not part of the plan (GSE125583, fusiform cortex; 125 advanced AD, 70 controls). The advanced AD group was younger than the controls (median 84 versus 87 years; correlation between group and age r = −0.27; Wilcoxon P = 4.7 × 10⁻⁴), so age was included in all adjusted models (and in both models of the H1 replication).</w:t>
       </w:r>
     </w:p>
     <w:p>
@@ -5918,7 +4269,7 @@
         <w:pStyle w:val="BodyText"/>
       </w:pPr>
       <w:r>
-        <w:t xml:space="preserve">Writing the plan down before the analyses is what made these errors visible. Analysis decisions taken after seeing the data raise the false-positive rate (Simmons et al., 2011), and preregistration lowers that risk by separating hypothesis generation from hypothesis testing (Nosek et al., 2018). Here the plan did three concrete things. Its definitions of donor-level pseudobulk and of age as a covariate made it possible to see where the implementation had strayed. Its fixed H2 thresholds (for example, an odds ratio of at least 3) stopped the DU quadrant, which strengthened in the corrected analysis, from being presented after the fact as a finding. And its rule against reformulating hypotheses kept the exploratory DD signal from becoming the main claim of the paper. The experience also shows that a plan works only if the implementation is checked against it regularly, and that outside readers catch things the author does not: the replication and the decomposition in this paper came from an external review. The audit and the re-analyses were run in an order in which every decision was committed before its results were produced.</w:t>
+        <w:t xml:space="preserve">Writing the plan down before the analyses is what made these errors visible. Analysis decisions taken after seeing the data raise the false-positive rate (Simmons et al., 2011), and a written plan reduces that risk by separating hypothesis generation from hypothesis testing (Nosek et al., 2018). Here, the plan’s definitions of donor-level pseudobulk and of the age covariate showed where the implementation had strayed, and its fixed H2 thresholds kept a quadrant that strengthened after correction from being presented as a finding after the fact. The experience also shows that a plan protects an analysis only if the implementation is checked against it, and that outside readers catch problems the author does not: the replication and the decomposition reported here came from an external review.</w:t>
       </w:r>
     </w:p>
     <w:bookmarkEnd w:id="42"/>
@@ -5986,7 +4337,7 @@
         <w:pStyle w:val="BodyText"/>
       </w:pPr>
       <w:r>
-        <w:t xml:space="preserve">The AD meta-cohort is small (n = 51) and relies on merging two microarray platforms with ComBat. The complete loss of AD DEGs in this cohort did not recur in the larger GSE125583 cohort, where about 31% remained significant after adjustment, so the size of the effect in the meta-cohort should not be generalised; preserving diagnosis as a covariate can inflate significance in later tests when groups are unevenly spread across datasets (Nygaard et al., 2016). The plan’s exclusion criteria for RNA quality and manner of death could not be applied to the GTEx samples. In the primary AD meta-cohort, no Braak stage was recorded for the controls, so their level of tau pathology is unknown. In GSE125583, the controls were not free of pathology: most were at Braak stage III or IV, so the contrast with advanced AD is between late and intermediate tau stages and probably underestimates the disease effect; the AD group was also younger than the controls. The first version of this cohort attached age and sex to the expression profiles by position rather than by sample identifier. The error was found when the cohort was rebuilt from the public data; after correction the H1 decision did not change (shared-DEG ratio 0.074 before and 0.082 after), and all numbers reported here come from the corrected cohort. The Neftel data are publicly available only as TPM values, which are not ideal for negative binomial models; a limma-trend analysis on log-scaled TPM gave the same H2 decision. Finally, although the analysis plan was committed to a local git repository before any data were analysed, the public upload that the plan promised did not happen before the analysis. The timestamps were generated by the author and cannot be verified independently, so the study follows a documented analysis plan and is not a preregistered study. Every point where the implementation departed from the plan is recorded in the deviation register, together with the date on which it was found.</w:t>
+        <w:t xml:space="preserve">The AD meta-cohort is small (n = 51) and relies on merging two microarray platforms with ComBat. The complete loss of AD DEGs in this cohort did not recur in the larger GSE125583 cohort, where about 31% remained significant after adjustment, so the size of the effect in the meta-cohort should not be generalised; preserving diagnosis as a covariate can inflate significance in later tests when groups are unevenly spread across datasets (Nygaard et al., 2016). The plan’s exclusion criteria for RNA quality and manner of death could not be applied to the GTEx samples. In the primary AD meta-cohort, no Braak stage was recorded for the controls, so their level of tau pathology is unknown. In GSE125583, the controls were not free of pathology: most were at Braak stage III or IV, so the contrast with advanced AD is between late and intermediate tau stages and probably underestimates the disease effect; the AD group was also younger than the controls. The first version of this cohort attached age and sex to the expression profiles by position rather than by sample identifier. The error was found when the cohort was rebuilt from the public data; after correction the H1 decision did not change (shared-DEG ratio 0.074 before and 0.082 after), and all numbers reported here come from the corrected cohort. Age was not modelled in the GBM bulk cohort, and tumour and control donors may differ in age; age is available only in ten-year bands in the open-access GTEx phenotypes. The Neftel data are publicly available only as TPM values, which are not ideal for negative binomial models; a limma-trend analysis on log-scaled TPM gave the same H2 decision. Finally, although the analysis plan was committed to a local git repository before any data were analysed, the public upload that the plan promised did not happen before the analysis. The timestamps were generated by the author and cannot be verified independently, so the study follows a documented analysis plan and is not a preregistered study. Every point where the implementation departed from the plan is recorded in the deviation register, together with the date on which it was found.</w:t>
       </w:r>
     </w:p>
     <w:bookmarkEnd w:id="44"/>
@@ -6647,7 +4998,7 @@
         <w:t xml:space="preserve"> </w:t>
       </w:r>
       <w:r>
-        <w:t xml:space="preserve">Exploratory: sensitivity of the original DD signal to analytic corrections. (A) Genes at FDR &lt; 0.05 in the original pseudoreplicated analysis, with a donor block (limma-voom) and with donor-summed counts (edgeR). (B) log2FC in the original versus the donor-summed analysis; orange points are the 20 genes of the original DD quadrant. (C) Threshold profile of the four-quadrant overlap test for the DD and DU quadrants with the original ranking and a donor-block (limma-voom) ranking; the dotted line marks BH-adjusted P = 0.05. (D) Highest −log10(P) in the RRHO2 DD quadrant for the original analysis, the deviation analysis (donor-summed, age-adjusted) and the plan analysis; the dashed line marks adjusted P = 0.001. The full donor × age decomposition is given in Table 6. Abbreviations: BH, Benjamini-Hochberg; DD, down in both diseases; DU, down in Alzheimer’s disease and up in glioblastoma; FDR, false discovery rate; log2FC, log2 fold change; RRHO2, rank-rank hypergeometric overlap, version 2.</w:t>
+        <w:t xml:space="preserve">Exploratory: sensitivity of the original DD signal to analytic corrections. (A) Genes at FDR &lt; 0.05 in the original pseudoreplicated analysis, with a donor block (limma-voom) and with donor-summed counts (edgeR). (B) log2FC in the original versus the donor-summed analysis; orange points are the 20 genes of the original DD quadrant. (C) Threshold profile of the four-quadrant overlap test for the DD and DU quadrants with the original ranking and a donor-block (limma-voom) ranking; the dotted line marks BH-adjusted P = 0.05. (D) Highest −log10(P) in the RRHO2 DD quadrant for the original analysis, the deviation analysis (donor-summed, age-adjusted) and the plan analysis; the dashed line marks adjusted P = 0.001. The full donor × age decomposition is given in Table 5. Abbreviations: BH, Benjamini-Hochberg; DD, down in both diseases; DU, down in Alzheimer’s disease and up in glioblastoma; FDR, false discovery rate; log2FC, log2 fold change; RRHO2, rank-rank hypergeometric overlap, version 2.</w:t>
       </w:r>
     </w:p>
     <w:bookmarkEnd w:id="54"/>

</xml_diff>

<commit_message>
Third review round: H2 'not supported' (plan label noted); Supp. File 2 updated (title, journal as historical); shorter plan narrative in Introduction and Discussion 4.4
</commit_message>
<xml_diff>
--- a/manuscript/drafts/manuscript_NoA.docx
+++ b/manuscript/drafts/manuscript_NoA.docx
@@ -145,7 +145,7 @@
         <w:pStyle w:val="BodyText"/>
       </w:pPr>
       <w:r>
-        <w:t xml:space="preserve">Both questions were tested under an analysis plan written before any data were analysed. The primary hypothesis (H1) predicted that shared differentially expressed genes (DEGs) between AD and GBM would largely disappear once cell composition was controlled with two independent deconvolution methods. The secondary hypothesis (H2) predicted that any remaining signal would reflect overlap between the AD vulnerable-neuron signature and the GBM neural-mimicry signature, assessed with three complementary tests. Because the outcome of H1 had already been seen in the earlier analysis, the plan framed H1 from the start as a re-test, and its replication in an independent cohort carries more weight than the primary test. Flexible, data-dependent analysis decisions inflate false-positive rates (Simmons et al., 2011), the hypotheses, thresholds, decision rules and publication framings for both possible outcomes were written down before the analyses (Nosek et al., 2018), and every deviation from the plan was logged with its date. Age runs through both questions. AD and GBM are diseases of older age, cohorts of post-mortem brain often differ in age between groups, and age-related differences in cell composition and gene expression can mimic disease effects. Age was therefore a covariate in every AD model (Stage 1 and both bulk AD cohorts). It was not modelled in the GBM bulk cohort, and the Stage 2 comparison of cell states within tumours controls for it by design. Because comparisons between donors in single-cell data need donor-level inference (Squair et al., 2021), the implementation was also audited against the plan during the study, and the effect of the problems it uncovered on the results is reported.</w:t>
+        <w:t xml:space="preserve">Both questions were tested under an analysis plan written before the data were analysed (Section 2.1). The primary hypothesis (H1) predicted that shared differentially expressed genes (DEGs) between AD and GBM would largely disappear once cell composition was controlled with two deconvolution methods. Because this outcome had already been seen in the earlier analysis, H1 is a re-test, and its replication in an independent cohort carries more weight. The secondary hypothesis (H2) predicted that any remaining signal would reflect overlap between the AD vulnerable-neuron signature and the GBM neural-mimicry signature, assessed with three complementary tests. Age runs through both questions: AD and GBM are diseases of older age, cohorts of post-mortem brain often differ in age between groups, and age-related differences in cell composition and gene expression can mimic disease effects. Age was therefore a covariate in every AD model (Stage 1 and both bulk AD cohorts); it was not modelled in the GBM bulk cohort, and the Stage 2 comparison of cell states within tumours controls for it by design.</w:t>
       </w:r>
     </w:p>
     <w:bookmarkEnd w:id="21"/>
@@ -2278,13 +2278,13 @@
       </w:r>
     </w:p>
     <w:bookmarkEnd w:id="32"/>
-    <w:bookmarkStart w:id="33" w:name="Xcc280955954448ed138960cbde2b4af277359f7"/>
+    <w:bookmarkStart w:id="33" w:name="X05868d7d343fc43e5cc97f544efac335c8e05b2"/>
     <w:p>
       <w:pPr>
         <w:pStyle w:val="Heading3"/>
       </w:pPr>
       <w:r>
-        <w:t xml:space="preserve">3.2 H2: no convergence between AD vulnerable-neuron identity and GBM neural-mimicry states</w:t>
+        <w:t xml:space="preserve">3.2 H2: no convergence detected between AD vulnerable-neuron identity and GBM neural-mimicry states</w:t>
       </w:r>
     </w:p>
     <w:p>
@@ -2319,6 +2319,42 @@
       </w:r>
       <w:r>
         <w:t xml:space="preserve">H2: results of the three pre-specified tests. RRHO2 values are the highest −log10(P) in each quadrant; quadrant boundaries are set where the ranking statistic changes sign in each list. Adjusted P values are capped at 1.</w:t>
+      </w:r>
+      <w:r>
+        <w:t xml:space="preserve"> </w:t>
+      </w:r>
+      <w:r>
+        <w:t xml:space="preserve">“</w:t>
+      </w:r>
+      <w:r>
+        <w:t xml:space="preserve">Not supported</w:t>
+      </w:r>
+      <w:r>
+        <w:t xml:space="preserve">”</w:t>
+      </w:r>
+      <w:r>
+        <w:t xml:space="preserve"> </w:t>
+      </w:r>
+      <w:r>
+        <w:t xml:space="preserve">corresponds to the outcome that the plan’s decision rule labels</w:t>
+      </w:r>
+      <w:r>
+        <w:t xml:space="preserve"> </w:t>
+      </w:r>
+      <w:r>
+        <w:t xml:space="preserve">“</w:t>
+      </w:r>
+      <w:r>
+        <w:t xml:space="preserve">rejected</w:t>
+      </w:r>
+      <w:r>
+        <w:t xml:space="preserve">”</w:t>
+      </w:r>
+      <w:r>
+        <w:t xml:space="preserve"> </w:t>
+      </w:r>
+      <w:r>
+        <w:t xml:space="preserve">(two or more tests failed).</w:t>
       </w:r>
     </w:p>
     <w:tbl>
@@ -2580,7 +2616,7 @@
                 <w:rFonts w:ascii="Times New Roman" w:hAnsi="Times New Roman"/>
                 <w:sz w:val="20"/>
               </w:rPr>
-              <w:t xml:space="preserve">Rejected (0/3)</w:t>
+              <w:t xml:space="preserve">Not supported (0/3)</w:t>
             </w:r>
           </w:p>
         </w:tc>
@@ -2684,7 +2720,7 @@
                 <w:rFonts w:ascii="Times New Roman" w:hAnsi="Times New Roman"/>
                 <w:sz w:val="20"/>
               </w:rPr>
-              <w:t xml:space="preserve">Rejected (0/3)</w:t>
+              <w:t xml:space="preserve">Not supported (0/3)</w:t>
             </w:r>
           </w:p>
         </w:tc>
@@ -2788,7 +2824,7 @@
                 <w:rFonts w:ascii="Times New Roman" w:hAnsi="Times New Roman"/>
                 <w:sz w:val="20"/>
               </w:rPr>
-              <w:t xml:space="preserve">Rejected (0/3)</w:t>
+              <w:t xml:space="preserve">Not supported (0/3)</w:t>
             </w:r>
           </w:p>
         </w:tc>
@@ -2817,7 +2853,22 @@
         <w:pStyle w:val="BodyText"/>
       </w:pPr>
       <w:r>
-        <w:t xml:space="preserve">None of the three tests passed in the plan-conformant analysis, and H2 was rejected. The documented Braak II deviation and the original implementation give the same answer. In the original implementation, the strong signal on the RRHO2 map (adjusted P = 5.3 × 10⁻⁴) sits not in the DU quadrant required by the plan but in the quadrant of genes down in both diseases (DD; Figure 3, left panel). Since the plan requires Test 1 to be judged in the DU quadrant, the original H2 evaluation also passed none of the three tests.</w:t>
+        <w:t xml:space="preserve">None of the three tests passed in the plan-conformant analysis, so H2 was not supported (the outcome that the plan’s decision rule labels</w:t>
+      </w:r>
+      <w:r>
+        <w:t xml:space="preserve"> </w:t>
+      </w:r>
+      <w:r>
+        <w:t xml:space="preserve">“</w:t>
+      </w:r>
+      <w:r>
+        <w:t xml:space="preserve">rejected</w:t>
+      </w:r>
+      <w:r>
+        <w:t xml:space="preserve">”</w:t>
+      </w:r>
+      <w:r>
+        <w:t xml:space="preserve">). With three donors per group, this means that no overlap was detected, not that none exists. The documented Braak II deviation and the original implementation give the same answer. In the original implementation, the strong signal on the RRHO2 map (adjusted P = 5.3 × 10⁻⁴) sits not in the DU quadrant required by the plan but in the quadrant of genes down in both diseases (DD; Figure 3, left panel). Since the plan requires Test 1 to be judged in the DU quadrant, the original H2 evaluation also passed none of the three tests.</w:t>
       </w:r>
     </w:p>
     <w:p>
@@ -2833,7 +2884,7 @@
         <w:pStyle w:val="BodyText"/>
       </w:pPr>
       <w:r>
-        <w:t xml:space="preserve">The rejection does not depend on how the GBM signature was estimated. With limma-trend on log-scaled TPM instead of edgeR on rounded TPM, the GBM log2FC values correlated at r = 0.879 with the original ones, and H2 was again rejected in both the plan analysis (DU maximum 2.50, adjusted P = 1; odds ratio 1.52; permutation P = 0.098) and the deviation analysis (DU maximum 3.37, adjusted P = 0.788; odds ratio 1.40; permutation P = 0.157).</w:t>
+        <w:t xml:space="preserve">This result does not depend on how the GBM signature was estimated. With limma-trend on log-scaled TPM instead of edgeR on rounded TPM, the GBM log2FC values correlated at r = 0.879 with the original ones, and H2 was again not supported in both the plan analysis (DU maximum 2.50, adjusted P = 1; odds ratio 1.52; permutation P = 0.098) and the deviation analysis (DU maximum 3.37, adjusted P = 0.788; odds ratio 1.40; permutation P = 0.157).</w:t>
       </w:r>
     </w:p>
     <w:bookmarkEnd w:id="33"/>
@@ -4103,15 +4154,15 @@
         <w:pStyle w:val="FirstParagraph"/>
       </w:pPr>
       <w:r>
-        <w:t xml:space="preserve">This study asked, under a plan fixed before any analysis, how much of the transcriptomic convergence reported between AD and GBM survives control for cell composition, and whether any remaining signal corresponds to a shared neural identity at cell-type resolution. The primary hypothesis (H1) was supported. The 1,458 shared DEGs found without composition adjustment fell to zero after adjustment, with BRETIGEA and, formally, with MuSiC. The secondary hypothesis (H2) was rejected, because none of the three pre-specified tests passed in the plan-conformant analysis, in the documented deviation or in the original implementation. Among the publication scenarios defined in the plan, this pattern corresponds to the one in which bulk AD-GBM convergence mostly reflects differences in composition and no detectable overlap exists between the identity of vulnerable AD neurons and the neural-mimicry states of GBM.</w:t>
-      </w:r>
-    </w:p>
-    <w:p>
-      <w:pPr>
-        <w:pStyle w:val="BodyText"/>
-      </w:pPr>
-      <w:r>
-        <w:t xml:space="preserve">The two results do not carry the same weight. The H1 result holds across all pre-specified sensitivity analyses, survives a negative control that rules out loss of statistical power, and replicates, as a marked reduction rather than a complete loss, in an independent AD cohort. Of the two deconvolution methods, only BRETIGEA gave plausible composition estimates, so the weight of the evidence rests on BRETIGEA in two AD cohorts, not on MuSiC. The rejection of H2 has to be read alongside the limited power of the discovery cohort, which is discussed in Section 4.3.</w:t>
+        <w:t xml:space="preserve">This study asked, under a plan fixed before any analysis, how much of the transcriptomic convergence reported between AD and GBM survives control for cell composition, and whether any remaining signal corresponds to a shared neural identity at cell-type resolution. The primary hypothesis (H1) was supported. The 1,458 shared DEGs found without composition adjustment fell to zero after adjustment, with BRETIGEA and, formally, with MuSiC. The secondary hypothesis (H2) was not supported: none of the three pre-specified tests passed in the plan-conformant analysis, in the documented deviation or in the original implementation. Among the publication scenarios defined in the plan, this pattern corresponds to the one in which bulk AD-GBM convergence mostly reflects differences in composition and no detectable overlap exists between the identity of vulnerable AD neurons and the neural-mimicry states of GBM.</w:t>
+      </w:r>
+    </w:p>
+    <w:p>
+      <w:pPr>
+        <w:pStyle w:val="BodyText"/>
+      </w:pPr>
+      <w:r>
+        <w:t xml:space="preserve">The two results do not carry the same weight. The H1 result holds across all pre-specified sensitivity analyses, survives a negative control that rules out loss of statistical power, and replicates, as a marked reduction rather than a complete loss, in an independent AD cohort. Of the two deconvolution methods, only BRETIGEA gave plausible composition estimates, so the weight of the evidence rests on BRETIGEA in two AD cohorts, not on MuSiC. This result has to be read alongside the limited power of the discovery cohort, which is discussed in Section 4.3.</w:t>
       </w:r>
     </w:p>
     <w:p>
@@ -4179,7 +4230,7 @@
         <w:pStyle w:val="BodyText"/>
       </w:pPr>
       <w:r>
-        <w:t xml:space="preserve">For this reason the rejection of H2 should be read as</w:t>
+        <w:t xml:space="preserve">For this reason the H2 result should be read as</w:t>
       </w:r>
       <w:r>
         <w:t xml:space="preserve"> </w:t>
@@ -4269,7 +4320,7 @@
         <w:pStyle w:val="BodyText"/>
       </w:pPr>
       <w:r>
-        <w:t xml:space="preserve">Writing the plan down before the analyses is what made these errors visible. Analysis decisions taken after seeing the data raise the false-positive rate (Simmons et al., 2011), and a written plan reduces that risk by separating hypothesis generation from hypothesis testing (Nosek et al., 2018). Here, the plan’s definitions of donor-level pseudobulk and of the age covariate showed where the implementation had strayed, and its fixed H2 thresholds kept a quadrant that strengthened after correction from being presented as a finding after the fact. The experience also shows that a plan protects an analysis only if the implementation is checked against it, and that outside readers catch problems the author does not: the replication and the decomposition reported here came from an external review.</w:t>
+        <w:t xml:space="preserve">Writing the plan down before the analyses made these errors visible: its definitions of donor-level pseudobulk and of the age covariate showed where the implementation had strayed, and its fixed H2 thresholds kept a quadrant that strengthened after correction from being presented as a finding after the fact (Simmons et al., 2011; Nosek et al., 2018). A plan protects an analysis only if the implementation is checked against it.</w:t>
       </w:r>
     </w:p>
     <w:bookmarkEnd w:id="42"/>

</xml_diff>